<commit_message>
full report and evidence upload
</commit_message>
<xml_diff>
--- a/API Security Risk Analysis Report.docx
+++ b/API Security Risk Analysis Report.docx
@@ -31,7 +31,7 @@
                     <pic:cNvPicPr/>
                   </pic:nvPicPr>
                   <pic:blipFill>
-                    <a:blip r:embed="rId4">
+                    <a:blip r:embed="rId7">
                       <a:extLst>
                         <a:ext uri="{28A0092B-C50C-407E-A947-70E740481C1C}">
                           <a14:useLocalDpi xmlns:a14="http://schemas.microsoft.com/office/drawing/2010/main" val="0"/>
@@ -70,14 +70,4351 @@
       </w:r>
     </w:p>
     <w:p/>
+    <w:p>
+      <w:pPr>
+        <w:rPr>
+          <w:b/>
+          <w:bCs/>
+          <w:color w:val="153D63" w:themeColor="text2" w:themeTint="E6"/>
+          <w:sz w:val="40"/>
+          <w:szCs w:val="40"/>
+        </w:rPr>
+      </w:pPr>
+      <w:r>
+        <w:rPr>
+          <w:b/>
+          <w:bCs/>
+          <w:color w:val="153D63" w:themeColor="text2" w:themeTint="E6"/>
+          <w:sz w:val="40"/>
+          <w:szCs w:val="40"/>
+        </w:rPr>
+        <w:t>Table of Contents</w:t>
+      </w:r>
+    </w:p>
+    <w:sdt>
+      <w:sdtPr>
+        <w:id w:val="1330185178"/>
+        <w:docPartObj>
+          <w:docPartGallery w:val="Table of Contents"/>
+          <w:docPartUnique/>
+        </w:docPartObj>
+      </w:sdtPr>
+      <w:sdtEndPr>
+        <w:rPr>
+          <w:rFonts w:asciiTheme="minorHAnsi" w:eastAsiaTheme="minorHAnsi" w:hAnsiTheme="minorHAnsi" w:cstheme="minorBidi"/>
+          <w:b/>
+          <w:bCs/>
+          <w:noProof/>
+          <w:color w:val="auto"/>
+          <w:kern w:val="2"/>
+          <w:sz w:val="24"/>
+          <w:szCs w:val="24"/>
+          <w:lang w:val="en-ZA"/>
+          <w14:ligatures w14:val="standardContextual"/>
+        </w:rPr>
+      </w:sdtEndPr>
+      <w:sdtContent>
+        <w:p>
+          <w:pPr>
+            <w:pStyle w:val="TOCHeading"/>
+          </w:pPr>
+          <w:r>
+            <w:t>Contents</w:t>
+          </w:r>
+        </w:p>
+        <w:p>
+          <w:pPr>
+            <w:pStyle w:val="TOC1"/>
+            <w:tabs>
+              <w:tab w:val="right" w:leader="dot" w:pos="9016"/>
+            </w:tabs>
+            <w:rPr>
+              <w:rFonts w:eastAsiaTheme="minorEastAsia"/>
+              <w:noProof/>
+              <w:lang w:eastAsia="en-ZA"/>
+            </w:rPr>
+          </w:pPr>
+          <w:r>
+            <w:fldChar w:fldCharType="begin"/>
+          </w:r>
+          <w:r>
+            <w:instrText xml:space="preserve"> TOC \o "1-3" \h \z \u </w:instrText>
+          </w:r>
+          <w:r>
+            <w:fldChar w:fldCharType="separate"/>
+          </w:r>
+          <w:hyperlink w:anchor="_Toc233715751" w:history="1">
+            <w:r>
+              <w:rPr>
+                <w:rStyle w:val="Hyperlink"/>
+                <w:b/>
+                <w:bCs/>
+                <w:noProof/>
+                <w:color w:val="auto"/>
+              </w:rPr>
+              <w:t>1. Executive Summary</w:t>
+            </w:r>
+            <w:r>
+              <w:rPr>
+                <w:noProof/>
+                <w:webHidden/>
+              </w:rPr>
+              <w:tab/>
+            </w:r>
+            <w:r>
+              <w:rPr>
+                <w:noProof/>
+                <w:webHidden/>
+              </w:rPr>
+              <w:fldChar w:fldCharType="begin"/>
+            </w:r>
+            <w:r>
+              <w:rPr>
+                <w:noProof/>
+                <w:webHidden/>
+              </w:rPr>
+              <w:instrText xml:space="preserve"> PAGEREF _Toc233715751 \h </w:instrText>
+            </w:r>
+            <w:r>
+              <w:rPr>
+                <w:noProof/>
+                <w:webHidden/>
+              </w:rPr>
+            </w:r>
+            <w:r>
+              <w:rPr>
+                <w:noProof/>
+                <w:webHidden/>
+              </w:rPr>
+              <w:fldChar w:fldCharType="separate"/>
+            </w:r>
+            <w:r>
+              <w:rPr>
+                <w:noProof/>
+                <w:webHidden/>
+              </w:rPr>
+              <w:t>3</w:t>
+            </w:r>
+            <w:r>
+              <w:rPr>
+                <w:noProof/>
+                <w:webHidden/>
+              </w:rPr>
+              <w:fldChar w:fldCharType="end"/>
+            </w:r>
+          </w:hyperlink>
+        </w:p>
+        <w:p>
+          <w:pPr>
+            <w:pStyle w:val="TOC1"/>
+            <w:tabs>
+              <w:tab w:val="right" w:leader="dot" w:pos="9016"/>
+            </w:tabs>
+            <w:rPr>
+              <w:rFonts w:eastAsiaTheme="minorEastAsia"/>
+              <w:noProof/>
+              <w:lang w:eastAsia="en-ZA"/>
+            </w:rPr>
+          </w:pPr>
+          <w:hyperlink w:anchor="_Toc233715752" w:history="1">
+            <w:r>
+              <w:rPr>
+                <w:rStyle w:val="Hyperlink"/>
+                <w:b/>
+                <w:bCs/>
+                <w:noProof/>
+                <w:color w:val="auto"/>
+              </w:rPr>
+              <w:t>2. Objectives</w:t>
+            </w:r>
+            <w:r>
+              <w:rPr>
+                <w:noProof/>
+                <w:webHidden/>
+              </w:rPr>
+              <w:tab/>
+            </w:r>
+            <w:r>
+              <w:rPr>
+                <w:noProof/>
+                <w:webHidden/>
+              </w:rPr>
+              <w:fldChar w:fldCharType="begin"/>
+            </w:r>
+            <w:r>
+              <w:rPr>
+                <w:noProof/>
+                <w:webHidden/>
+              </w:rPr>
+              <w:instrText xml:space="preserve"> PAGEREF _Toc233715752 \h </w:instrText>
+            </w:r>
+            <w:r>
+              <w:rPr>
+                <w:noProof/>
+                <w:webHidden/>
+              </w:rPr>
+            </w:r>
+            <w:r>
+              <w:rPr>
+                <w:noProof/>
+                <w:webHidden/>
+              </w:rPr>
+              <w:fldChar w:fldCharType="separate"/>
+            </w:r>
+            <w:r>
+              <w:rPr>
+                <w:noProof/>
+                <w:webHidden/>
+              </w:rPr>
+              <w:t>3</w:t>
+            </w:r>
+            <w:r>
+              <w:rPr>
+                <w:noProof/>
+                <w:webHidden/>
+              </w:rPr>
+              <w:fldChar w:fldCharType="end"/>
+            </w:r>
+          </w:hyperlink>
+        </w:p>
+        <w:p>
+          <w:pPr>
+            <w:pStyle w:val="TOC1"/>
+            <w:tabs>
+              <w:tab w:val="right" w:leader="dot" w:pos="9016"/>
+            </w:tabs>
+            <w:rPr>
+              <w:rFonts w:eastAsiaTheme="minorEastAsia"/>
+              <w:noProof/>
+              <w:lang w:eastAsia="en-ZA"/>
+            </w:rPr>
+          </w:pPr>
+          <w:hyperlink w:anchor="_Toc233715753" w:history="1">
+            <w:r>
+              <w:rPr>
+                <w:rStyle w:val="Hyperlink"/>
+                <w:b/>
+                <w:bCs/>
+                <w:noProof/>
+                <w:color w:val="auto"/>
+              </w:rPr>
+              <w:t>3. Scope</w:t>
+            </w:r>
+            <w:r>
+              <w:rPr>
+                <w:noProof/>
+                <w:webHidden/>
+              </w:rPr>
+              <w:tab/>
+            </w:r>
+            <w:r>
+              <w:rPr>
+                <w:noProof/>
+                <w:webHidden/>
+              </w:rPr>
+              <w:fldChar w:fldCharType="begin"/>
+            </w:r>
+            <w:r>
+              <w:rPr>
+                <w:noProof/>
+                <w:webHidden/>
+              </w:rPr>
+              <w:instrText xml:space="preserve"> PAGEREF _Toc233715753 \h </w:instrText>
+            </w:r>
+            <w:r>
+              <w:rPr>
+                <w:noProof/>
+                <w:webHidden/>
+              </w:rPr>
+            </w:r>
+            <w:r>
+              <w:rPr>
+                <w:noProof/>
+                <w:webHidden/>
+              </w:rPr>
+              <w:fldChar w:fldCharType="separate"/>
+            </w:r>
+            <w:r>
+              <w:rPr>
+                <w:noProof/>
+                <w:webHidden/>
+              </w:rPr>
+              <w:t>3</w:t>
+            </w:r>
+            <w:r>
+              <w:rPr>
+                <w:noProof/>
+                <w:webHidden/>
+              </w:rPr>
+              <w:fldChar w:fldCharType="end"/>
+            </w:r>
+          </w:hyperlink>
+        </w:p>
+        <w:p>
+          <w:pPr>
+            <w:pStyle w:val="TOC1"/>
+            <w:tabs>
+              <w:tab w:val="right" w:leader="dot" w:pos="9016"/>
+            </w:tabs>
+            <w:rPr>
+              <w:rFonts w:eastAsiaTheme="minorEastAsia"/>
+              <w:noProof/>
+              <w:lang w:eastAsia="en-ZA"/>
+            </w:rPr>
+          </w:pPr>
+          <w:hyperlink w:anchor="_Toc233715754" w:history="1">
+            <w:r>
+              <w:rPr>
+                <w:rStyle w:val="Hyperlink"/>
+                <w:b/>
+                <w:bCs/>
+                <w:noProof/>
+                <w:color w:val="auto"/>
+              </w:rPr>
+              <w:t>4. API Overview</w:t>
+            </w:r>
+            <w:r>
+              <w:rPr>
+                <w:noProof/>
+                <w:webHidden/>
+              </w:rPr>
+              <w:tab/>
+            </w:r>
+            <w:r>
+              <w:rPr>
+                <w:noProof/>
+                <w:webHidden/>
+              </w:rPr>
+              <w:fldChar w:fldCharType="begin"/>
+            </w:r>
+            <w:r>
+              <w:rPr>
+                <w:noProof/>
+                <w:webHidden/>
+              </w:rPr>
+              <w:instrText xml:space="preserve"> PAGEREF _Toc233715754 \h </w:instrText>
+            </w:r>
+            <w:r>
+              <w:rPr>
+                <w:noProof/>
+                <w:webHidden/>
+              </w:rPr>
+            </w:r>
+            <w:r>
+              <w:rPr>
+                <w:noProof/>
+                <w:webHidden/>
+              </w:rPr>
+              <w:fldChar w:fldCharType="separate"/>
+            </w:r>
+            <w:r>
+              <w:rPr>
+                <w:noProof/>
+                <w:webHidden/>
+              </w:rPr>
+              <w:t>3</w:t>
+            </w:r>
+            <w:r>
+              <w:rPr>
+                <w:noProof/>
+                <w:webHidden/>
+              </w:rPr>
+              <w:fldChar w:fldCharType="end"/>
+            </w:r>
+          </w:hyperlink>
+        </w:p>
+        <w:p>
+          <w:pPr>
+            <w:pStyle w:val="TOC1"/>
+            <w:tabs>
+              <w:tab w:val="right" w:leader="dot" w:pos="9016"/>
+            </w:tabs>
+            <w:rPr>
+              <w:rFonts w:eastAsiaTheme="minorEastAsia"/>
+              <w:noProof/>
+              <w:lang w:eastAsia="en-ZA"/>
+            </w:rPr>
+          </w:pPr>
+          <w:hyperlink w:anchor="_Toc233715755" w:history="1">
+            <w:r>
+              <w:rPr>
+                <w:rStyle w:val="Hyperlink"/>
+                <w:b/>
+                <w:bCs/>
+                <w:noProof/>
+                <w:color w:val="auto"/>
+              </w:rPr>
+              <w:t>5. Tools Used</w:t>
+            </w:r>
+            <w:r>
+              <w:rPr>
+                <w:noProof/>
+                <w:webHidden/>
+              </w:rPr>
+              <w:tab/>
+            </w:r>
+            <w:r>
+              <w:rPr>
+                <w:noProof/>
+                <w:webHidden/>
+              </w:rPr>
+              <w:fldChar w:fldCharType="begin"/>
+            </w:r>
+            <w:r>
+              <w:rPr>
+                <w:noProof/>
+                <w:webHidden/>
+              </w:rPr>
+              <w:instrText xml:space="preserve"> PAGEREF _Toc233715755 \h </w:instrText>
+            </w:r>
+            <w:r>
+              <w:rPr>
+                <w:noProof/>
+                <w:webHidden/>
+              </w:rPr>
+            </w:r>
+            <w:r>
+              <w:rPr>
+                <w:noProof/>
+                <w:webHidden/>
+              </w:rPr>
+              <w:fldChar w:fldCharType="separate"/>
+            </w:r>
+            <w:r>
+              <w:rPr>
+                <w:noProof/>
+                <w:webHidden/>
+              </w:rPr>
+              <w:t>3</w:t>
+            </w:r>
+            <w:r>
+              <w:rPr>
+                <w:noProof/>
+                <w:webHidden/>
+              </w:rPr>
+              <w:fldChar w:fldCharType="end"/>
+            </w:r>
+          </w:hyperlink>
+        </w:p>
+        <w:p>
+          <w:pPr>
+            <w:pStyle w:val="TOC1"/>
+            <w:tabs>
+              <w:tab w:val="right" w:leader="dot" w:pos="9016"/>
+            </w:tabs>
+            <w:rPr>
+              <w:rFonts w:eastAsiaTheme="minorEastAsia"/>
+              <w:noProof/>
+              <w:lang w:eastAsia="en-ZA"/>
+            </w:rPr>
+          </w:pPr>
+          <w:hyperlink w:anchor="_Toc233715756" w:history="1">
+            <w:r>
+              <w:rPr>
+                <w:rStyle w:val="Hyperlink"/>
+                <w:b/>
+                <w:bCs/>
+                <w:noProof/>
+                <w:color w:val="auto"/>
+              </w:rPr>
+              <w:t>6. Methodology</w:t>
+            </w:r>
+            <w:r>
+              <w:rPr>
+                <w:noProof/>
+                <w:webHidden/>
+              </w:rPr>
+              <w:tab/>
+            </w:r>
+            <w:r>
+              <w:rPr>
+                <w:noProof/>
+                <w:webHidden/>
+              </w:rPr>
+              <w:fldChar w:fldCharType="begin"/>
+            </w:r>
+            <w:r>
+              <w:rPr>
+                <w:noProof/>
+                <w:webHidden/>
+              </w:rPr>
+              <w:instrText xml:space="preserve"> PAGEREF _Toc233715756 \h </w:instrText>
+            </w:r>
+            <w:r>
+              <w:rPr>
+                <w:noProof/>
+                <w:webHidden/>
+              </w:rPr>
+            </w:r>
+            <w:r>
+              <w:rPr>
+                <w:noProof/>
+                <w:webHidden/>
+              </w:rPr>
+              <w:fldChar w:fldCharType="separate"/>
+            </w:r>
+            <w:r>
+              <w:rPr>
+                <w:noProof/>
+                <w:webHidden/>
+              </w:rPr>
+              <w:t>4</w:t>
+            </w:r>
+            <w:r>
+              <w:rPr>
+                <w:noProof/>
+                <w:webHidden/>
+              </w:rPr>
+              <w:fldChar w:fldCharType="end"/>
+            </w:r>
+          </w:hyperlink>
+        </w:p>
+        <w:p>
+          <w:pPr>
+            <w:pStyle w:val="TOC1"/>
+            <w:tabs>
+              <w:tab w:val="right" w:leader="dot" w:pos="9016"/>
+            </w:tabs>
+            <w:rPr>
+              <w:rFonts w:eastAsiaTheme="minorEastAsia"/>
+              <w:noProof/>
+              <w:lang w:eastAsia="en-ZA"/>
+            </w:rPr>
+          </w:pPr>
+          <w:hyperlink w:anchor="_Toc233715757" w:history="1">
+            <w:r>
+              <w:rPr>
+                <w:rStyle w:val="Hyperlink"/>
+                <w:b/>
+                <w:bCs/>
+                <w:noProof/>
+                <w:color w:val="auto"/>
+              </w:rPr>
+              <w:t>7. Findings</w:t>
+            </w:r>
+            <w:r>
+              <w:rPr>
+                <w:noProof/>
+                <w:webHidden/>
+              </w:rPr>
+              <w:tab/>
+            </w:r>
+            <w:r>
+              <w:rPr>
+                <w:noProof/>
+                <w:webHidden/>
+              </w:rPr>
+              <w:fldChar w:fldCharType="begin"/>
+            </w:r>
+            <w:r>
+              <w:rPr>
+                <w:noProof/>
+                <w:webHidden/>
+              </w:rPr>
+              <w:instrText xml:space="preserve"> PAGEREF _Toc233715757 \h </w:instrText>
+            </w:r>
+            <w:r>
+              <w:rPr>
+                <w:noProof/>
+                <w:webHidden/>
+              </w:rPr>
+            </w:r>
+            <w:r>
+              <w:rPr>
+                <w:noProof/>
+                <w:webHidden/>
+              </w:rPr>
+              <w:fldChar w:fldCharType="separate"/>
+            </w:r>
+            <w:r>
+              <w:rPr>
+                <w:noProof/>
+                <w:webHidden/>
+              </w:rPr>
+              <w:t>5</w:t>
+            </w:r>
+            <w:r>
+              <w:rPr>
+                <w:noProof/>
+                <w:webHidden/>
+              </w:rPr>
+              <w:fldChar w:fldCharType="end"/>
+            </w:r>
+          </w:hyperlink>
+        </w:p>
+        <w:p>
+          <w:pPr>
+            <w:pStyle w:val="TOC2"/>
+            <w:tabs>
+              <w:tab w:val="right" w:leader="dot" w:pos="9016"/>
+            </w:tabs>
+            <w:rPr>
+              <w:rFonts w:eastAsiaTheme="minorEastAsia"/>
+              <w:noProof/>
+              <w:lang w:eastAsia="en-ZA"/>
+            </w:rPr>
+          </w:pPr>
+          <w:hyperlink w:anchor="_Toc233715758" w:history="1">
+            <w:r>
+              <w:rPr>
+                <w:rStyle w:val="Hyperlink"/>
+                <w:noProof/>
+                <w:color w:val="auto"/>
+              </w:rPr>
+              <w:t>API-01- Unauthenticated Endpoints</w:t>
+            </w:r>
+            <w:r>
+              <w:rPr>
+                <w:noProof/>
+                <w:webHidden/>
+              </w:rPr>
+              <w:tab/>
+            </w:r>
+            <w:r>
+              <w:rPr>
+                <w:noProof/>
+                <w:webHidden/>
+              </w:rPr>
+              <w:fldChar w:fldCharType="begin"/>
+            </w:r>
+            <w:r>
+              <w:rPr>
+                <w:noProof/>
+                <w:webHidden/>
+              </w:rPr>
+              <w:instrText xml:space="preserve"> PAGEREF _Toc233715758 \h </w:instrText>
+            </w:r>
+            <w:r>
+              <w:rPr>
+                <w:noProof/>
+                <w:webHidden/>
+              </w:rPr>
+            </w:r>
+            <w:r>
+              <w:rPr>
+                <w:noProof/>
+                <w:webHidden/>
+              </w:rPr>
+              <w:fldChar w:fldCharType="separate"/>
+            </w:r>
+            <w:r>
+              <w:rPr>
+                <w:noProof/>
+                <w:webHidden/>
+              </w:rPr>
+              <w:t>5</w:t>
+            </w:r>
+            <w:r>
+              <w:rPr>
+                <w:noProof/>
+                <w:webHidden/>
+              </w:rPr>
+              <w:fldChar w:fldCharType="end"/>
+            </w:r>
+          </w:hyperlink>
+        </w:p>
+        <w:p>
+          <w:pPr>
+            <w:pStyle w:val="TOC2"/>
+            <w:tabs>
+              <w:tab w:val="right" w:leader="dot" w:pos="9016"/>
+            </w:tabs>
+            <w:rPr>
+              <w:rFonts w:eastAsiaTheme="minorEastAsia"/>
+              <w:noProof/>
+              <w:lang w:eastAsia="en-ZA"/>
+            </w:rPr>
+          </w:pPr>
+          <w:hyperlink w:anchor="_Toc233715759" w:history="1">
+            <w:r>
+              <w:rPr>
+                <w:rStyle w:val="Hyperlink"/>
+                <w:noProof/>
+                <w:color w:val="auto"/>
+              </w:rPr>
+              <w:t>API-02 - Excessive Data Exposure</w:t>
+            </w:r>
+            <w:r>
+              <w:rPr>
+                <w:noProof/>
+                <w:webHidden/>
+              </w:rPr>
+              <w:tab/>
+            </w:r>
+            <w:r>
+              <w:rPr>
+                <w:noProof/>
+                <w:webHidden/>
+              </w:rPr>
+              <w:fldChar w:fldCharType="begin"/>
+            </w:r>
+            <w:r>
+              <w:rPr>
+                <w:noProof/>
+                <w:webHidden/>
+              </w:rPr>
+              <w:instrText xml:space="preserve"> PAGEREF _Toc233715759 \h </w:instrText>
+            </w:r>
+            <w:r>
+              <w:rPr>
+                <w:noProof/>
+                <w:webHidden/>
+              </w:rPr>
+            </w:r>
+            <w:r>
+              <w:rPr>
+                <w:noProof/>
+                <w:webHidden/>
+              </w:rPr>
+              <w:fldChar w:fldCharType="separate"/>
+            </w:r>
+            <w:r>
+              <w:rPr>
+                <w:noProof/>
+                <w:webHidden/>
+              </w:rPr>
+              <w:t>6</w:t>
+            </w:r>
+            <w:r>
+              <w:rPr>
+                <w:noProof/>
+                <w:webHidden/>
+              </w:rPr>
+              <w:fldChar w:fldCharType="end"/>
+            </w:r>
+          </w:hyperlink>
+        </w:p>
+        <w:p>
+          <w:pPr>
+            <w:pStyle w:val="TOC2"/>
+            <w:tabs>
+              <w:tab w:val="right" w:leader="dot" w:pos="9016"/>
+            </w:tabs>
+            <w:rPr>
+              <w:rFonts w:eastAsiaTheme="minorEastAsia"/>
+              <w:noProof/>
+              <w:lang w:eastAsia="en-ZA"/>
+            </w:rPr>
+          </w:pPr>
+          <w:hyperlink w:anchor="_Toc233715760" w:history="1">
+            <w:r>
+              <w:rPr>
+                <w:rStyle w:val="Hyperlink"/>
+                <w:noProof/>
+                <w:color w:val="auto"/>
+              </w:rPr>
+              <w:t>API-03 - Information Disclosure (API Response)</w:t>
+            </w:r>
+            <w:r>
+              <w:rPr>
+                <w:noProof/>
+                <w:webHidden/>
+              </w:rPr>
+              <w:tab/>
+            </w:r>
+            <w:r>
+              <w:rPr>
+                <w:noProof/>
+                <w:webHidden/>
+              </w:rPr>
+              <w:fldChar w:fldCharType="begin"/>
+            </w:r>
+            <w:r>
+              <w:rPr>
+                <w:noProof/>
+                <w:webHidden/>
+              </w:rPr>
+              <w:instrText xml:space="preserve"> PAGEREF _Toc233715760 \h </w:instrText>
+            </w:r>
+            <w:r>
+              <w:rPr>
+                <w:noProof/>
+                <w:webHidden/>
+              </w:rPr>
+            </w:r>
+            <w:r>
+              <w:rPr>
+                <w:noProof/>
+                <w:webHidden/>
+              </w:rPr>
+              <w:fldChar w:fldCharType="separate"/>
+            </w:r>
+            <w:r>
+              <w:rPr>
+                <w:noProof/>
+                <w:webHidden/>
+              </w:rPr>
+              <w:t>7</w:t>
+            </w:r>
+            <w:r>
+              <w:rPr>
+                <w:noProof/>
+                <w:webHidden/>
+              </w:rPr>
+              <w:fldChar w:fldCharType="end"/>
+            </w:r>
+          </w:hyperlink>
+        </w:p>
+        <w:p>
+          <w:pPr>
+            <w:pStyle w:val="TOC2"/>
+            <w:tabs>
+              <w:tab w:val="right" w:leader="dot" w:pos="9016"/>
+            </w:tabs>
+            <w:rPr>
+              <w:rFonts w:eastAsiaTheme="minorEastAsia"/>
+              <w:noProof/>
+              <w:lang w:eastAsia="en-ZA"/>
+            </w:rPr>
+          </w:pPr>
+          <w:hyperlink w:anchor="_Toc233715761" w:history="1">
+            <w:r>
+              <w:rPr>
+                <w:rStyle w:val="Hyperlink"/>
+                <w:noProof/>
+                <w:color w:val="auto"/>
+              </w:rPr>
+              <w:t>API-04 - Graceful Handling of Invalid Requests</w:t>
+            </w:r>
+            <w:r>
+              <w:rPr>
+                <w:noProof/>
+                <w:webHidden/>
+              </w:rPr>
+              <w:tab/>
+            </w:r>
+            <w:r>
+              <w:rPr>
+                <w:noProof/>
+                <w:webHidden/>
+              </w:rPr>
+              <w:fldChar w:fldCharType="begin"/>
+            </w:r>
+            <w:r>
+              <w:rPr>
+                <w:noProof/>
+                <w:webHidden/>
+              </w:rPr>
+              <w:instrText xml:space="preserve"> PAGEREF _Toc233715761 \h </w:instrText>
+            </w:r>
+            <w:r>
+              <w:rPr>
+                <w:noProof/>
+                <w:webHidden/>
+              </w:rPr>
+            </w:r>
+            <w:r>
+              <w:rPr>
+                <w:noProof/>
+                <w:webHidden/>
+              </w:rPr>
+              <w:fldChar w:fldCharType="separate"/>
+            </w:r>
+            <w:r>
+              <w:rPr>
+                <w:noProof/>
+                <w:webHidden/>
+              </w:rPr>
+              <w:t>8</w:t>
+            </w:r>
+            <w:r>
+              <w:rPr>
+                <w:noProof/>
+                <w:webHidden/>
+              </w:rPr>
+              <w:fldChar w:fldCharType="end"/>
+            </w:r>
+          </w:hyperlink>
+        </w:p>
+        <w:p>
+          <w:pPr>
+            <w:pStyle w:val="TOC2"/>
+            <w:tabs>
+              <w:tab w:val="right" w:leader="dot" w:pos="9016"/>
+            </w:tabs>
+            <w:rPr>
+              <w:rFonts w:eastAsiaTheme="minorEastAsia"/>
+              <w:noProof/>
+              <w:lang w:eastAsia="en-ZA"/>
+            </w:rPr>
+          </w:pPr>
+          <w:hyperlink w:anchor="_Toc233715762" w:history="1">
+            <w:r>
+              <w:rPr>
+                <w:rStyle w:val="Hyperlink"/>
+                <w:noProof/>
+                <w:color w:val="auto"/>
+              </w:rPr>
+              <w:t>API-05 - Response Header Analysis</w:t>
+            </w:r>
+            <w:r>
+              <w:rPr>
+                <w:noProof/>
+                <w:webHidden/>
+              </w:rPr>
+              <w:tab/>
+            </w:r>
+            <w:r>
+              <w:rPr>
+                <w:noProof/>
+                <w:webHidden/>
+              </w:rPr>
+              <w:fldChar w:fldCharType="begin"/>
+            </w:r>
+            <w:r>
+              <w:rPr>
+                <w:noProof/>
+                <w:webHidden/>
+              </w:rPr>
+              <w:instrText xml:space="preserve"> PAGEREF _Toc233715762 \h </w:instrText>
+            </w:r>
+            <w:r>
+              <w:rPr>
+                <w:noProof/>
+                <w:webHidden/>
+              </w:rPr>
+            </w:r>
+            <w:r>
+              <w:rPr>
+                <w:noProof/>
+                <w:webHidden/>
+              </w:rPr>
+              <w:fldChar w:fldCharType="separate"/>
+            </w:r>
+            <w:r>
+              <w:rPr>
+                <w:noProof/>
+                <w:webHidden/>
+              </w:rPr>
+              <w:t>9</w:t>
+            </w:r>
+            <w:r>
+              <w:rPr>
+                <w:noProof/>
+                <w:webHidden/>
+              </w:rPr>
+              <w:fldChar w:fldCharType="end"/>
+            </w:r>
+          </w:hyperlink>
+        </w:p>
+        <w:p>
+          <w:pPr>
+            <w:pStyle w:val="TOC1"/>
+            <w:tabs>
+              <w:tab w:val="right" w:leader="dot" w:pos="9016"/>
+            </w:tabs>
+            <w:rPr>
+              <w:rFonts w:eastAsiaTheme="minorEastAsia"/>
+              <w:noProof/>
+              <w:lang w:eastAsia="en-ZA"/>
+            </w:rPr>
+          </w:pPr>
+          <w:hyperlink w:anchor="_Toc233715763" w:history="1">
+            <w:r>
+              <w:rPr>
+                <w:rStyle w:val="Hyperlink"/>
+                <w:b/>
+                <w:bCs/>
+                <w:noProof/>
+                <w:color w:val="auto"/>
+              </w:rPr>
+              <w:t>8. Overall Risk Summary</w:t>
+            </w:r>
+            <w:r>
+              <w:rPr>
+                <w:noProof/>
+                <w:webHidden/>
+              </w:rPr>
+              <w:tab/>
+            </w:r>
+            <w:r>
+              <w:rPr>
+                <w:noProof/>
+                <w:webHidden/>
+              </w:rPr>
+              <w:fldChar w:fldCharType="begin"/>
+            </w:r>
+            <w:r>
+              <w:rPr>
+                <w:noProof/>
+                <w:webHidden/>
+              </w:rPr>
+              <w:instrText xml:space="preserve"> PAGEREF _Toc233715763 \h </w:instrText>
+            </w:r>
+            <w:r>
+              <w:rPr>
+                <w:noProof/>
+                <w:webHidden/>
+              </w:rPr>
+            </w:r>
+            <w:r>
+              <w:rPr>
+                <w:noProof/>
+                <w:webHidden/>
+              </w:rPr>
+              <w:fldChar w:fldCharType="separate"/>
+            </w:r>
+            <w:r>
+              <w:rPr>
+                <w:noProof/>
+                <w:webHidden/>
+              </w:rPr>
+              <w:t>10</w:t>
+            </w:r>
+            <w:r>
+              <w:rPr>
+                <w:noProof/>
+                <w:webHidden/>
+              </w:rPr>
+              <w:fldChar w:fldCharType="end"/>
+            </w:r>
+          </w:hyperlink>
+        </w:p>
+        <w:p>
+          <w:pPr>
+            <w:pStyle w:val="TOC1"/>
+            <w:tabs>
+              <w:tab w:val="right" w:leader="dot" w:pos="9016"/>
+            </w:tabs>
+            <w:rPr>
+              <w:rFonts w:eastAsiaTheme="minorEastAsia"/>
+              <w:noProof/>
+              <w:lang w:eastAsia="en-ZA"/>
+            </w:rPr>
+          </w:pPr>
+          <w:hyperlink w:anchor="_Toc233715764" w:history="1">
+            <w:r>
+              <w:rPr>
+                <w:rStyle w:val="Hyperlink"/>
+                <w:b/>
+                <w:bCs/>
+                <w:noProof/>
+                <w:color w:val="auto"/>
+              </w:rPr>
+              <w:t>9.Recommendations</w:t>
+            </w:r>
+            <w:r>
+              <w:rPr>
+                <w:noProof/>
+                <w:webHidden/>
+              </w:rPr>
+              <w:tab/>
+            </w:r>
+            <w:r>
+              <w:rPr>
+                <w:noProof/>
+                <w:webHidden/>
+              </w:rPr>
+              <w:fldChar w:fldCharType="begin"/>
+            </w:r>
+            <w:r>
+              <w:rPr>
+                <w:noProof/>
+                <w:webHidden/>
+              </w:rPr>
+              <w:instrText xml:space="preserve"> PAGEREF _Toc233715764 \h </w:instrText>
+            </w:r>
+            <w:r>
+              <w:rPr>
+                <w:noProof/>
+                <w:webHidden/>
+              </w:rPr>
+            </w:r>
+            <w:r>
+              <w:rPr>
+                <w:noProof/>
+                <w:webHidden/>
+              </w:rPr>
+              <w:fldChar w:fldCharType="separate"/>
+            </w:r>
+            <w:r>
+              <w:rPr>
+                <w:noProof/>
+                <w:webHidden/>
+              </w:rPr>
+              <w:t>10</w:t>
+            </w:r>
+            <w:r>
+              <w:rPr>
+                <w:noProof/>
+                <w:webHidden/>
+              </w:rPr>
+              <w:fldChar w:fldCharType="end"/>
+            </w:r>
+          </w:hyperlink>
+        </w:p>
+        <w:p>
+          <w:pPr>
+            <w:pStyle w:val="TOC1"/>
+            <w:tabs>
+              <w:tab w:val="right" w:leader="dot" w:pos="9016"/>
+            </w:tabs>
+            <w:rPr>
+              <w:rFonts w:eastAsiaTheme="minorEastAsia"/>
+              <w:noProof/>
+              <w:lang w:eastAsia="en-ZA"/>
+            </w:rPr>
+          </w:pPr>
+          <w:hyperlink w:anchor="_Toc233715765" w:history="1">
+            <w:r>
+              <w:rPr>
+                <w:rStyle w:val="Hyperlink"/>
+                <w:b/>
+                <w:bCs/>
+                <w:noProof/>
+                <w:color w:val="auto"/>
+              </w:rPr>
+              <w:t>10. Conclusion</w:t>
+            </w:r>
+            <w:r>
+              <w:rPr>
+                <w:noProof/>
+                <w:webHidden/>
+              </w:rPr>
+              <w:tab/>
+            </w:r>
+            <w:r>
+              <w:rPr>
+                <w:noProof/>
+                <w:webHidden/>
+              </w:rPr>
+              <w:fldChar w:fldCharType="begin"/>
+            </w:r>
+            <w:r>
+              <w:rPr>
+                <w:noProof/>
+                <w:webHidden/>
+              </w:rPr>
+              <w:instrText xml:space="preserve"> PAGEREF _Toc233715765 \h </w:instrText>
+            </w:r>
+            <w:r>
+              <w:rPr>
+                <w:noProof/>
+                <w:webHidden/>
+              </w:rPr>
+            </w:r>
+            <w:r>
+              <w:rPr>
+                <w:noProof/>
+                <w:webHidden/>
+              </w:rPr>
+              <w:fldChar w:fldCharType="separate"/>
+            </w:r>
+            <w:r>
+              <w:rPr>
+                <w:noProof/>
+                <w:webHidden/>
+              </w:rPr>
+              <w:t>10</w:t>
+            </w:r>
+            <w:r>
+              <w:rPr>
+                <w:noProof/>
+                <w:webHidden/>
+              </w:rPr>
+              <w:fldChar w:fldCharType="end"/>
+            </w:r>
+          </w:hyperlink>
+        </w:p>
+        <w:p>
+          <w:pPr>
+            <w:pStyle w:val="TOC1"/>
+            <w:tabs>
+              <w:tab w:val="right" w:leader="dot" w:pos="9016"/>
+            </w:tabs>
+            <w:rPr>
+              <w:rFonts w:eastAsiaTheme="minorEastAsia"/>
+              <w:noProof/>
+              <w:lang w:eastAsia="en-ZA"/>
+            </w:rPr>
+          </w:pPr>
+          <w:hyperlink w:anchor="_Toc233715766" w:history="1">
+            <w:r>
+              <w:rPr>
+                <w:rStyle w:val="Hyperlink"/>
+                <w:b/>
+                <w:bCs/>
+                <w:noProof/>
+                <w:color w:val="auto"/>
+              </w:rPr>
+              <w:t>11. References</w:t>
+            </w:r>
+            <w:r>
+              <w:rPr>
+                <w:noProof/>
+                <w:webHidden/>
+              </w:rPr>
+              <w:tab/>
+            </w:r>
+            <w:r>
+              <w:rPr>
+                <w:noProof/>
+                <w:webHidden/>
+              </w:rPr>
+              <w:fldChar w:fldCharType="begin"/>
+            </w:r>
+            <w:r>
+              <w:rPr>
+                <w:noProof/>
+                <w:webHidden/>
+              </w:rPr>
+              <w:instrText xml:space="preserve"> PAGEREF _Toc233715766 \h </w:instrText>
+            </w:r>
+            <w:r>
+              <w:rPr>
+                <w:noProof/>
+                <w:webHidden/>
+              </w:rPr>
+            </w:r>
+            <w:r>
+              <w:rPr>
+                <w:noProof/>
+                <w:webHidden/>
+              </w:rPr>
+              <w:fldChar w:fldCharType="separate"/>
+            </w:r>
+            <w:r>
+              <w:rPr>
+                <w:noProof/>
+                <w:webHidden/>
+              </w:rPr>
+              <w:t>10</w:t>
+            </w:r>
+            <w:r>
+              <w:rPr>
+                <w:noProof/>
+                <w:webHidden/>
+              </w:rPr>
+              <w:fldChar w:fldCharType="end"/>
+            </w:r>
+          </w:hyperlink>
+        </w:p>
+        <w:p>
+          <w:pPr>
+            <w:pStyle w:val="TOC1"/>
+            <w:tabs>
+              <w:tab w:val="right" w:leader="dot" w:pos="9016"/>
+            </w:tabs>
+            <w:rPr>
+              <w:rFonts w:eastAsiaTheme="minorEastAsia"/>
+              <w:noProof/>
+              <w:lang w:eastAsia="en-ZA"/>
+            </w:rPr>
+          </w:pPr>
+          <w:hyperlink w:anchor="_Toc233715767" w:history="1">
+            <w:r>
+              <w:rPr>
+                <w:rStyle w:val="Hyperlink"/>
+                <w:b/>
+                <w:bCs/>
+                <w:noProof/>
+                <w:color w:val="auto"/>
+              </w:rPr>
+              <w:t>12. Appendices</w:t>
+            </w:r>
+            <w:r>
+              <w:rPr>
+                <w:noProof/>
+                <w:webHidden/>
+              </w:rPr>
+              <w:tab/>
+            </w:r>
+            <w:r>
+              <w:rPr>
+                <w:noProof/>
+                <w:webHidden/>
+              </w:rPr>
+              <w:fldChar w:fldCharType="begin"/>
+            </w:r>
+            <w:r>
+              <w:rPr>
+                <w:noProof/>
+                <w:webHidden/>
+              </w:rPr>
+              <w:instrText xml:space="preserve"> PAGEREF _Toc233715767 \h </w:instrText>
+            </w:r>
+            <w:r>
+              <w:rPr>
+                <w:noProof/>
+                <w:webHidden/>
+              </w:rPr>
+            </w:r>
+            <w:r>
+              <w:rPr>
+                <w:noProof/>
+                <w:webHidden/>
+              </w:rPr>
+              <w:fldChar w:fldCharType="separate"/>
+            </w:r>
+            <w:r>
+              <w:rPr>
+                <w:noProof/>
+                <w:webHidden/>
+              </w:rPr>
+              <w:t>11</w:t>
+            </w:r>
+            <w:r>
+              <w:rPr>
+                <w:noProof/>
+                <w:webHidden/>
+              </w:rPr>
+              <w:fldChar w:fldCharType="end"/>
+            </w:r>
+          </w:hyperlink>
+        </w:p>
+        <w:p>
+          <w:r>
+            <w:rPr>
+              <w:b/>
+              <w:bCs/>
+              <w:noProof/>
+            </w:rPr>
+            <w:fldChar w:fldCharType="end"/>
+          </w:r>
+        </w:p>
+      </w:sdtContent>
+    </w:sdt>
+    <w:p/>
+    <w:p>
+      <w:r>
+        <w:br w:type="page"/>
+      </w:r>
+    </w:p>
+    <w:p>
+      <w:pPr>
+        <w:pStyle w:val="Heading1"/>
+        <w:rPr>
+          <w:b/>
+          <w:bCs/>
+          <w:color w:val="153D63" w:themeColor="text2" w:themeTint="E6"/>
+        </w:rPr>
+      </w:pPr>
+      <w:bookmarkStart w:id="0" w:name="_Toc233715751"/>
+      <w:r>
+        <w:rPr>
+          <w:b/>
+          <w:bCs/>
+          <w:color w:val="153D63" w:themeColor="text2" w:themeTint="E6"/>
+        </w:rPr>
+        <w:lastRenderedPageBreak/>
+        <w:t>1. Executive Summary</w:t>
+      </w:r>
+      <w:bookmarkEnd w:id="0"/>
+    </w:p>
+    <w:p>
+      <w:r>
+        <w:t xml:space="preserve">This report presents the findings of an API Security Risk Analysis performed on the </w:t>
+      </w:r>
+      <w:r>
+        <w:t>JSON Placeholder</w:t>
+      </w:r>
+      <w:r>
+        <w:t xml:space="preserve"> public testing API. The assessment focused on reviewing publicly accessible API endpoints, analysing response data, inspecting response headers, and identifying potential security risks that could affect a production environment. Although </w:t>
+      </w:r>
+      <w:r>
+        <w:t>JSON Placeholder</w:t>
+      </w:r>
+      <w:r>
+        <w:t xml:space="preserve"> is intentionally designed as a public demonstration API, the analysis highlights security considerations that organisations should address when developing and deploying production APIs. Recommendations are provided to improve authentication, minimise unnecessary data exposure and strengthen overall API security.</w:t>
+      </w:r>
+    </w:p>
+    <w:p>
+      <w:pPr>
+        <w:pStyle w:val="Heading1"/>
+        <w:rPr>
+          <w:b/>
+          <w:bCs/>
+          <w:color w:val="153D63" w:themeColor="text2" w:themeTint="E6"/>
+        </w:rPr>
+      </w:pPr>
+      <w:bookmarkStart w:id="1" w:name="_Toc233715752"/>
+      <w:r>
+        <w:rPr>
+          <w:b/>
+          <w:bCs/>
+          <w:color w:val="153D63" w:themeColor="text2" w:themeTint="E6"/>
+        </w:rPr>
+        <w:t>2. Objectives</w:t>
+      </w:r>
+      <w:bookmarkEnd w:id="1"/>
+    </w:p>
+    <w:p>
+      <w:r>
+        <w:t>The objectives of this assessment were to:</w:t>
+      </w:r>
+    </w:p>
+    <w:p>
+      <w:pPr>
+        <w:numPr>
+          <w:ilvl w:val="0"/>
+          <w:numId w:val="1"/>
+        </w:numPr>
+      </w:pPr>
+      <w:r>
+        <w:t xml:space="preserve">Analyse a public API using Postman. </w:t>
+      </w:r>
+    </w:p>
+    <w:p>
+      <w:pPr>
+        <w:numPr>
+          <w:ilvl w:val="0"/>
+          <w:numId w:val="1"/>
+        </w:numPr>
+      </w:pPr>
+      <w:r>
+        <w:t xml:space="preserve">Inspect API requests, responses and headers. </w:t>
+      </w:r>
+    </w:p>
+    <w:p>
+      <w:pPr>
+        <w:numPr>
+          <w:ilvl w:val="0"/>
+          <w:numId w:val="1"/>
+        </w:numPr>
+      </w:pPr>
+      <w:r>
+        <w:t xml:space="preserve">Identify common API security risks. </w:t>
+      </w:r>
+    </w:p>
+    <w:p>
+      <w:pPr>
+        <w:numPr>
+          <w:ilvl w:val="0"/>
+          <w:numId w:val="1"/>
+        </w:numPr>
+      </w:pPr>
+      <w:r>
+        <w:t xml:space="preserve">Assess the potential business impact of identified risks. </w:t>
+      </w:r>
+    </w:p>
+    <w:p>
+      <w:pPr>
+        <w:numPr>
+          <w:ilvl w:val="0"/>
+          <w:numId w:val="1"/>
+        </w:numPr>
+      </w:pPr>
+      <w:r>
+        <w:t>Provide practical recommendations to improve API security.</w:t>
+      </w:r>
+    </w:p>
+    <w:p>
+      <w:pPr>
+        <w:pStyle w:val="Heading1"/>
+        <w:rPr>
+          <w:b/>
+          <w:bCs/>
+          <w:color w:val="153D63" w:themeColor="text2" w:themeTint="E6"/>
+        </w:rPr>
+      </w:pPr>
+      <w:bookmarkStart w:id="2" w:name="_Toc233715753"/>
+      <w:r>
+        <w:rPr>
+          <w:b/>
+          <w:bCs/>
+          <w:color w:val="153D63" w:themeColor="text2" w:themeTint="E6"/>
+        </w:rPr>
+        <w:t>3. Scope</w:t>
+      </w:r>
+      <w:bookmarkEnd w:id="2"/>
+    </w:p>
+    <w:p>
+      <w:r>
+        <w:t xml:space="preserve">The scope of this assessment was limited to the publicly available </w:t>
+      </w:r>
+      <w:proofErr w:type="spellStart"/>
+      <w:r>
+        <w:t>JSONPlaceholder</w:t>
+      </w:r>
+      <w:proofErr w:type="spellEnd"/>
+      <w:r>
+        <w:t xml:space="preserve"> API. Testing consisted only of safe, read-only requests (GET requests), response inspection and documentation-based analysis. No exploitation, authentication bypass attempts or denial-of-service testing was performed.</w:t>
+      </w:r>
+    </w:p>
+    <w:p>
+      <w:pPr>
+        <w:pStyle w:val="Heading1"/>
+        <w:rPr>
+          <w:b/>
+          <w:bCs/>
+          <w:color w:val="153D63" w:themeColor="text2" w:themeTint="E6"/>
+        </w:rPr>
+      </w:pPr>
+      <w:bookmarkStart w:id="3" w:name="_Toc233715754"/>
+      <w:r>
+        <w:rPr>
+          <w:b/>
+          <w:bCs/>
+          <w:color w:val="153D63" w:themeColor="text2" w:themeTint="E6"/>
+        </w:rPr>
+        <w:t>4. API Overview</w:t>
+      </w:r>
+      <w:bookmarkEnd w:id="3"/>
+    </w:p>
+    <w:p>
+      <w:proofErr w:type="spellStart"/>
+      <w:r>
+        <w:t>JSONPlaceholder</w:t>
+      </w:r>
+      <w:proofErr w:type="spellEnd"/>
+      <w:r>
+        <w:t xml:space="preserve"> is a free online REST API designed for developers to test applications without affecting real systems or sensitive information. The API provides sample resources such as posts, users, comments and albums, making it an ideal platform for learning API testing and security assessment techniques.</w:t>
+      </w:r>
+    </w:p>
+    <w:p>
+      <w:pPr>
+        <w:pStyle w:val="Heading1"/>
+        <w:rPr>
+          <w:b/>
+          <w:bCs/>
+          <w:color w:val="153D63" w:themeColor="text2" w:themeTint="E6"/>
+        </w:rPr>
+      </w:pPr>
+      <w:bookmarkStart w:id="4" w:name="_Toc233715755"/>
+      <w:r>
+        <w:rPr>
+          <w:b/>
+          <w:bCs/>
+          <w:color w:val="153D63" w:themeColor="text2" w:themeTint="E6"/>
+        </w:rPr>
+        <w:t>5. Tools Used</w:t>
+      </w:r>
+      <w:bookmarkEnd w:id="4"/>
+    </w:p>
+    <w:p>
+      <w:pPr>
+        <w:pStyle w:val="ListParagraph"/>
+        <w:numPr>
+          <w:ilvl w:val="0"/>
+          <w:numId w:val="1"/>
+        </w:numPr>
+      </w:pPr>
+      <w:r>
+        <w:rPr>
+          <w:b/>
+          <w:bCs/>
+        </w:rPr>
+        <w:t>Postman</w:t>
+      </w:r>
+      <w:r>
+        <w:t xml:space="preserve"> – Sent API requests and analysed responses. </w:t>
+      </w:r>
+    </w:p>
+    <w:p>
+      <w:pPr>
+        <w:pStyle w:val="ListParagraph"/>
+        <w:numPr>
+          <w:ilvl w:val="0"/>
+          <w:numId w:val="1"/>
+        </w:numPr>
+      </w:pPr>
+      <w:r>
+        <w:rPr>
+          <w:b/>
+          <w:bCs/>
+        </w:rPr>
+        <w:t>Browser Developer Tools</w:t>
+      </w:r>
+      <w:r>
+        <w:t xml:space="preserve"> – Reviewed response headers and API behaviour. </w:t>
+      </w:r>
+    </w:p>
+    <w:p>
+      <w:pPr>
+        <w:pStyle w:val="ListParagraph"/>
+        <w:numPr>
+          <w:ilvl w:val="0"/>
+          <w:numId w:val="1"/>
+        </w:numPr>
+      </w:pPr>
+      <w:r>
+        <w:rPr>
+          <w:b/>
+          <w:bCs/>
+        </w:rPr>
+        <w:lastRenderedPageBreak/>
+        <w:t>Microsoft Word</w:t>
+      </w:r>
+      <w:r>
+        <w:t xml:space="preserve"> – Prepared the security assessment report. </w:t>
+      </w:r>
+    </w:p>
+    <w:p>
+      <w:pPr>
+        <w:pStyle w:val="ListParagraph"/>
+        <w:numPr>
+          <w:ilvl w:val="0"/>
+          <w:numId w:val="1"/>
+        </w:numPr>
+      </w:pPr>
+      <w:r>
+        <w:rPr>
+          <w:b/>
+          <w:bCs/>
+        </w:rPr>
+        <w:t>GitHub</w:t>
+      </w:r>
+      <w:r>
+        <w:t xml:space="preserve"> – Hosted the completed project and supporting evidence.</w:t>
+      </w:r>
+    </w:p>
+    <w:p>
+      <w:pPr>
+        <w:pStyle w:val="Heading1"/>
+        <w:rPr>
+          <w:b/>
+          <w:bCs/>
+          <w:color w:val="153D63" w:themeColor="text2" w:themeTint="E6"/>
+        </w:rPr>
+      </w:pPr>
+      <w:bookmarkStart w:id="5" w:name="_Toc233715756"/>
+      <w:r>
+        <w:rPr>
+          <w:b/>
+          <w:bCs/>
+          <w:color w:val="153D63" w:themeColor="text2" w:themeTint="E6"/>
+        </w:rPr>
+        <w:t>6. Methodology</w:t>
+      </w:r>
+      <w:bookmarkEnd w:id="5"/>
+    </w:p>
+    <w:p>
+      <w:r>
+        <w:t>The API security assessment followed the steps below:</w:t>
+      </w:r>
+    </w:p>
+    <w:p>
+      <w:pPr>
+        <w:numPr>
+          <w:ilvl w:val="0"/>
+          <w:numId w:val="3"/>
+        </w:numPr>
+      </w:pPr>
+      <w:r>
+        <w:t xml:space="preserve">Selected the </w:t>
+      </w:r>
+      <w:proofErr w:type="spellStart"/>
+      <w:r>
+        <w:t>JSONPlaceholder</w:t>
+      </w:r>
+      <w:proofErr w:type="spellEnd"/>
+      <w:r>
+        <w:t xml:space="preserve"> public testing API. </w:t>
+      </w:r>
+    </w:p>
+    <w:p>
+      <w:pPr>
+        <w:numPr>
+          <w:ilvl w:val="0"/>
+          <w:numId w:val="3"/>
+        </w:numPr>
+      </w:pPr>
+      <w:r>
+        <w:t xml:space="preserve">Reviewed the available API documentation. </w:t>
+      </w:r>
+    </w:p>
+    <w:p>
+      <w:pPr>
+        <w:numPr>
+          <w:ilvl w:val="0"/>
+          <w:numId w:val="3"/>
+        </w:numPr>
+      </w:pPr>
+      <w:r>
+        <w:t xml:space="preserve">Sent GET requests using Postman. </w:t>
+      </w:r>
+    </w:p>
+    <w:p>
+      <w:pPr>
+        <w:numPr>
+          <w:ilvl w:val="0"/>
+          <w:numId w:val="3"/>
+        </w:numPr>
+      </w:pPr>
+      <w:r>
+        <w:t xml:space="preserve">Analysed HTTP response codes, response bodies and headers. </w:t>
+      </w:r>
+    </w:p>
+    <w:p>
+      <w:pPr>
+        <w:numPr>
+          <w:ilvl w:val="0"/>
+          <w:numId w:val="3"/>
+        </w:numPr>
+      </w:pPr>
+      <w:r>
+        <w:t xml:space="preserve">Identified potential API security risks. </w:t>
+      </w:r>
+    </w:p>
+    <w:p>
+      <w:pPr>
+        <w:numPr>
+          <w:ilvl w:val="0"/>
+          <w:numId w:val="3"/>
+        </w:numPr>
+      </w:pPr>
+      <w:r>
+        <w:t xml:space="preserve">Assessed the business impact of each finding. </w:t>
+      </w:r>
+    </w:p>
+    <w:p>
+      <w:pPr>
+        <w:numPr>
+          <w:ilvl w:val="0"/>
+          <w:numId w:val="3"/>
+        </w:numPr>
+      </w:pPr>
+      <w:r>
+        <w:t xml:space="preserve">Developed recommendations based on industry best practices. </w:t>
+      </w:r>
+    </w:p>
+    <w:p>
+      <w:pPr>
+        <w:numPr>
+          <w:ilvl w:val="0"/>
+          <w:numId w:val="3"/>
+        </w:numPr>
+      </w:pPr>
+      <w:r>
+        <w:t>Documented the assessment with supporting evidence.</w:t>
+      </w:r>
+    </w:p>
+    <w:p/>
+    <w:p/>
+    <w:p>
+      <w:r>
+        <w:br w:type="page"/>
+      </w:r>
+    </w:p>
+    <w:p>
+      <w:pPr>
+        <w:pStyle w:val="Heading1"/>
+        <w:rPr>
+          <w:b/>
+          <w:bCs/>
+          <w:color w:val="153D63" w:themeColor="text2" w:themeTint="E6"/>
+        </w:rPr>
+      </w:pPr>
+      <w:bookmarkStart w:id="6" w:name="_Toc233715757"/>
+      <w:r>
+        <w:rPr>
+          <w:b/>
+          <w:bCs/>
+          <w:color w:val="153D63" w:themeColor="text2" w:themeTint="E6"/>
+        </w:rPr>
+        <w:lastRenderedPageBreak/>
+        <w:t>7. Findings</w:t>
+      </w:r>
+      <w:bookmarkEnd w:id="6"/>
+    </w:p>
+    <w:p>
+      <w:pPr>
+        <w:pStyle w:val="Heading2"/>
+      </w:pPr>
+      <w:bookmarkStart w:id="7" w:name="_Toc233715758"/>
+      <w:r>
+        <w:t>API-01</w:t>
+      </w:r>
+      <w:r>
+        <w:t xml:space="preserve">- </w:t>
+      </w:r>
+      <w:r>
+        <w:t>Unauthenticated Endpoints</w:t>
+      </w:r>
+      <w:bookmarkEnd w:id="7"/>
+    </w:p>
+    <w:p>
+      <w:r>
+        <w:rPr>
+          <w:b/>
+          <w:bCs/>
+        </w:rPr>
+        <w:t>Finding</w:t>
+      </w:r>
+      <w:r>
+        <w:t xml:space="preserve"> </w:t>
+      </w:r>
+    </w:p>
+    <w:p>
+      <w:r>
+        <w:t>The /posts endpoint was successfully accessed using a simple GET request without requiring any authentication, API key or access token. The endpoint returned data immediately with an HTTP 200 OK response.</w:t>
+      </w:r>
+    </w:p>
+    <w:p>
+      <w:r>
+        <w:rPr>
+          <w:b/>
+          <w:bCs/>
+        </w:rPr>
+        <w:t>Risk</w:t>
+      </w:r>
+      <w:r>
+        <w:t xml:space="preserve"> </w:t>
+      </w:r>
+    </w:p>
+    <w:p>
+      <w:r>
+        <w:t>Medium</w:t>
+      </w:r>
+    </w:p>
+    <w:p>
+      <w:r>
+        <w:rPr>
+          <w:b/>
+          <w:bCs/>
+        </w:rPr>
+        <w:t>Description</w:t>
+      </w:r>
+      <w:r>
+        <w:t xml:space="preserve"> </w:t>
+      </w:r>
+    </w:p>
+    <w:p>
+      <w:r>
+        <w:t xml:space="preserve">The API allows public access to the /posts endpoint without requiring users to authenticate. Although this behaviour is expected for a demonstration API such as </w:t>
+      </w:r>
+      <w:r>
+        <w:t>JSON Placeholder</w:t>
+      </w:r>
+      <w:r>
+        <w:t>, a production API containing sensitive business or customer information should require authentication before granting access. Unauthenticated endpoints may allow unauthorised users to retrieve data that should only be available to authorised individuals.</w:t>
+      </w:r>
+    </w:p>
+    <w:p>
+      <w:r>
+        <w:rPr>
+          <w:b/>
+          <w:bCs/>
+        </w:rPr>
+        <w:t>Business Impact</w:t>
+      </w:r>
+      <w:r>
+        <w:t xml:space="preserve"> </w:t>
+      </w:r>
+    </w:p>
+    <w:p>
+      <w:r>
+        <w:t>If a production API exposes sensitive endpoints without authentication, attackers may gain access to confidential business or customer information. This could result in data breaches, loss of customer trust, regulatory compliance issues and reputational damage.</w:t>
+      </w:r>
+    </w:p>
+    <w:p>
+      <w:pPr>
+        <w:rPr>
+          <w:b/>
+          <w:bCs/>
+        </w:rPr>
+      </w:pPr>
+      <w:r>
+        <w:rPr>
+          <w:b/>
+          <w:bCs/>
+        </w:rPr>
+        <w:t>Recommendation</w:t>
+      </w:r>
+    </w:p>
+    <w:p>
+      <w:r>
+        <w:t>Require authentication for any endpoint that exposes sensitive or business-related information. Implement secure authentication mechanisms such as API keys, OAuth 2.0 or Bearer Tokens, and apply the principle of least privilege to ensure users can only access data they are authorised to view.</w:t>
+      </w:r>
+    </w:p>
+    <w:p>
+      <w:pPr>
+        <w:rPr>
+          <w:b/>
+          <w:bCs/>
+        </w:rPr>
+      </w:pPr>
+      <w:r>
+        <w:rPr>
+          <w:b/>
+          <w:bCs/>
+        </w:rPr>
+        <w:t>Evidence</w:t>
+      </w:r>
+    </w:p>
+    <w:p>
+      <w:r>
+        <w:rPr>
+          <w:noProof/>
+        </w:rPr>
+        <w:drawing>
+          <wp:inline distT="0" distB="0" distL="0" distR="0" wp14:anchorId="5B211E44" wp14:editId="58FE918C">
+            <wp:extent cx="2115434" cy="1613647"/>
+            <wp:effectExtent l="0" t="0" r="0" b="5715"/>
+            <wp:docPr id="1005004327" name="Picture 2"/>
+            <wp:cNvGraphicFramePr>
+              <a:graphicFrameLocks xmlns:a="http://schemas.openxmlformats.org/drawingml/2006/main" noChangeAspect="1"/>
+            </wp:cNvGraphicFramePr>
+            <a:graphic xmlns:a="http://schemas.openxmlformats.org/drawingml/2006/main">
+              <a:graphicData uri="http://schemas.openxmlformats.org/drawingml/2006/picture">
+                <pic:pic xmlns:pic="http://schemas.openxmlformats.org/drawingml/2006/picture">
+                  <pic:nvPicPr>
+                    <pic:cNvPr id="0" name="Picture 1"/>
+                    <pic:cNvPicPr>
+                      <a:picLocks noChangeAspect="1" noChangeArrowheads="1"/>
+                    </pic:cNvPicPr>
+                  </pic:nvPicPr>
+                  <pic:blipFill>
+                    <a:blip r:embed="rId8" cstate="print">
+                      <a:extLst>
+                        <a:ext uri="{28A0092B-C50C-407E-A947-70E740481C1C}">
+                          <a14:useLocalDpi xmlns:a14="http://schemas.microsoft.com/office/drawing/2010/main" val="0"/>
+                        </a:ext>
+                      </a:extLst>
+                    </a:blip>
+                    <a:srcRect/>
+                    <a:stretch>
+                      <a:fillRect/>
+                    </a:stretch>
+                  </pic:blipFill>
+                  <pic:spPr bwMode="auto">
+                    <a:xfrm>
+                      <a:off x="0" y="0"/>
+                      <a:ext cx="2181463" cy="1664014"/>
+                    </a:xfrm>
+                    <a:prstGeom prst="rect">
+                      <a:avLst/>
+                    </a:prstGeom>
+                    <a:noFill/>
+                    <a:ln>
+                      <a:noFill/>
+                    </a:ln>
+                  </pic:spPr>
+                </pic:pic>
+              </a:graphicData>
+            </a:graphic>
+          </wp:inline>
+        </w:drawing>
+      </w:r>
+    </w:p>
+    <w:p>
+      <w:pPr>
+        <w:pStyle w:val="Heading2"/>
+      </w:pPr>
+      <w:r>
+        <w:br w:type="page"/>
+      </w:r>
+      <w:bookmarkStart w:id="8" w:name="_Toc233715759"/>
+      <w:r>
+        <w:lastRenderedPageBreak/>
+        <w:t>API-02</w:t>
+      </w:r>
+      <w:r>
+        <w:t xml:space="preserve"> - </w:t>
+      </w:r>
+      <w:r>
+        <w:t>Excessive Data Exposure</w:t>
+      </w:r>
+      <w:bookmarkEnd w:id="8"/>
+    </w:p>
+    <w:p>
+      <w:r>
+        <w:rPr>
+          <w:b/>
+          <w:bCs/>
+        </w:rPr>
+        <w:t>Finding</w:t>
+      </w:r>
+      <w:r>
+        <w:t xml:space="preserve"> </w:t>
+      </w:r>
+    </w:p>
+    <w:p>
+      <w:r>
+        <w:t>The /users endpoint returned complete user records containing multiple data fields, including names, email addresses, phone numbers, company information and addresses.</w:t>
+      </w:r>
+    </w:p>
+    <w:p>
+      <w:r>
+        <w:rPr>
+          <w:b/>
+          <w:bCs/>
+        </w:rPr>
+        <w:t>Risk</w:t>
+      </w:r>
+      <w:r>
+        <w:t xml:space="preserve"> </w:t>
+      </w:r>
+    </w:p>
+    <w:p>
+      <w:r>
+        <w:t>Medium</w:t>
+      </w:r>
+    </w:p>
+    <w:p>
+      <w:r>
+        <w:rPr>
+          <w:b/>
+          <w:bCs/>
+        </w:rPr>
+        <w:t>Description</w:t>
+      </w:r>
+      <w:r>
+        <w:t xml:space="preserve"> </w:t>
+      </w:r>
+    </w:p>
+    <w:p>
+      <w:r>
+        <w:t xml:space="preserve">The API returns more information than may be necessary for many applications. Although the data is fictional within </w:t>
+      </w:r>
+      <w:proofErr w:type="spellStart"/>
+      <w:r>
+        <w:t>JSONPlaceholder</w:t>
+      </w:r>
+      <w:proofErr w:type="spellEnd"/>
+      <w:r>
+        <w:t>, production APIs should only return information required for the intended function. Excessive data exposure increases the amount of information available to attackers if an endpoint is compromised.</w:t>
+      </w:r>
+    </w:p>
+    <w:p>
+      <w:r>
+        <w:rPr>
+          <w:b/>
+          <w:bCs/>
+        </w:rPr>
+        <w:t>Business Impact</w:t>
+      </w:r>
+      <w:r>
+        <w:t xml:space="preserve"> </w:t>
+      </w:r>
+    </w:p>
+    <w:p>
+      <w:r>
+        <w:t>Returning unnecessary information may expose sensitive customer or organisational data, increasing the risk of privacy breaches and regulatory non-compliance. It also provides attackers with additional information that could be used for social engineering or targeted attacks.</w:t>
+      </w:r>
+    </w:p>
+    <w:p>
+      <w:pPr>
+        <w:rPr>
+          <w:b/>
+          <w:bCs/>
+        </w:rPr>
+      </w:pPr>
+      <w:r>
+        <w:rPr>
+          <w:b/>
+          <w:bCs/>
+        </w:rPr>
+        <w:t>Recommendation</w:t>
+      </w:r>
+    </w:p>
+    <w:p>
+      <w:r>
+        <w:t>Return only the minimum amount of information required by the application. Apply the principle of least privilege and minimise sensitive information included within API responses.</w:t>
+      </w:r>
+    </w:p>
+    <w:p>
+      <w:pPr>
+        <w:rPr>
+          <w:b/>
+          <w:bCs/>
+        </w:rPr>
+      </w:pPr>
+      <w:r>
+        <w:rPr>
+          <w:b/>
+          <w:bCs/>
+        </w:rPr>
+        <w:t xml:space="preserve">Evidence </w:t>
+      </w:r>
+    </w:p>
+    <w:p>
+      <w:r>
+        <w:rPr>
+          <w:noProof/>
+        </w:rPr>
+        <w:drawing>
+          <wp:inline distT="0" distB="0" distL="0" distR="0" wp14:anchorId="38EDDBC8" wp14:editId="7180104F">
+            <wp:extent cx="2458891" cy="1887892"/>
+            <wp:effectExtent l="0" t="0" r="0" b="0"/>
+            <wp:docPr id="809351338" name="Picture 3"/>
+            <wp:cNvGraphicFramePr>
+              <a:graphicFrameLocks xmlns:a="http://schemas.openxmlformats.org/drawingml/2006/main" noChangeAspect="1"/>
+            </wp:cNvGraphicFramePr>
+            <a:graphic xmlns:a="http://schemas.openxmlformats.org/drawingml/2006/main">
+              <a:graphicData uri="http://schemas.openxmlformats.org/drawingml/2006/picture">
+                <pic:pic xmlns:pic="http://schemas.openxmlformats.org/drawingml/2006/picture">
+                  <pic:nvPicPr>
+                    <pic:cNvPr id="0" name="Picture 3"/>
+                    <pic:cNvPicPr>
+                      <a:picLocks noChangeAspect="1" noChangeArrowheads="1"/>
+                    </pic:cNvPicPr>
+                  </pic:nvPicPr>
+                  <pic:blipFill>
+                    <a:blip r:embed="rId9" cstate="print">
+                      <a:extLst>
+                        <a:ext uri="{28A0092B-C50C-407E-A947-70E740481C1C}">
+                          <a14:useLocalDpi xmlns:a14="http://schemas.microsoft.com/office/drawing/2010/main" val="0"/>
+                        </a:ext>
+                      </a:extLst>
+                    </a:blip>
+                    <a:srcRect/>
+                    <a:stretch>
+                      <a:fillRect/>
+                    </a:stretch>
+                  </pic:blipFill>
+                  <pic:spPr bwMode="auto">
+                    <a:xfrm>
+                      <a:off x="0" y="0"/>
+                      <a:ext cx="2476728" cy="1901587"/>
+                    </a:xfrm>
+                    <a:prstGeom prst="rect">
+                      <a:avLst/>
+                    </a:prstGeom>
+                    <a:noFill/>
+                    <a:ln>
+                      <a:noFill/>
+                    </a:ln>
+                  </pic:spPr>
+                </pic:pic>
+              </a:graphicData>
+            </a:graphic>
+          </wp:inline>
+        </w:drawing>
+      </w:r>
+    </w:p>
+    <w:p>
+      <w:pPr>
+        <w:pStyle w:val="Heading2"/>
+      </w:pPr>
+      <w:r>
+        <w:br w:type="page"/>
+      </w:r>
+      <w:bookmarkStart w:id="9" w:name="_Toc233715760"/>
+      <w:r>
+        <w:lastRenderedPageBreak/>
+        <w:t>API-03</w:t>
+      </w:r>
+      <w:r>
+        <w:t xml:space="preserve"> - </w:t>
+      </w:r>
+      <w:r>
+        <w:t>Information Disclosure (API Response)</w:t>
+      </w:r>
+      <w:bookmarkEnd w:id="9"/>
+    </w:p>
+    <w:p>
+      <w:r>
+        <w:rPr>
+          <w:b/>
+          <w:bCs/>
+        </w:rPr>
+        <w:t>Finding</w:t>
+      </w:r>
+      <w:r>
+        <w:t xml:space="preserve"> </w:t>
+      </w:r>
+    </w:p>
+    <w:p>
+      <w:r>
+        <w:t>A request for an individual resource successfully returned the requested record without exposing additional system information or internal errors.</w:t>
+      </w:r>
+    </w:p>
+    <w:p>
+      <w:r>
+        <w:rPr>
+          <w:b/>
+          <w:bCs/>
+        </w:rPr>
+        <w:t>Risk</w:t>
+      </w:r>
+      <w:r>
+        <w:t xml:space="preserve"> </w:t>
+      </w:r>
+    </w:p>
+    <w:p>
+      <w:r>
+        <w:t>Low</w:t>
+      </w:r>
+    </w:p>
+    <w:p>
+      <w:r>
+        <w:rPr>
+          <w:b/>
+          <w:bCs/>
+        </w:rPr>
+        <w:t>Description</w:t>
+      </w:r>
+      <w:r>
+        <w:t xml:space="preserve"> </w:t>
+      </w:r>
+    </w:p>
+    <w:p>
+      <w:r>
+        <w:t>The API correctly returned only the requested resource. While no sensitive server information was disclosed during testing, production APIs should continue limiting response data to only what is required by the requesting client.</w:t>
+      </w:r>
+    </w:p>
+    <w:p>
+      <w:r>
+        <w:rPr>
+          <w:b/>
+          <w:bCs/>
+        </w:rPr>
+        <w:t>Business Impact</w:t>
+      </w:r>
+      <w:r>
+        <w:t xml:space="preserve"> </w:t>
+      </w:r>
+    </w:p>
+    <w:p>
+      <w:r>
+        <w:t>Restricting unnecessary information reduces opportunities for attackers to gather intelligence about internal systems or application structure.</w:t>
+      </w:r>
+    </w:p>
+    <w:p>
+      <w:pPr>
+        <w:rPr>
+          <w:b/>
+          <w:bCs/>
+        </w:rPr>
+      </w:pPr>
+      <w:r>
+        <w:rPr>
+          <w:b/>
+          <w:bCs/>
+        </w:rPr>
+        <w:t>Recommendation</w:t>
+      </w:r>
+    </w:p>
+    <w:p>
+      <w:r>
+        <w:t>Continue limiting API responses to required information only and regularly review responses for unnecessary fields.</w:t>
+      </w:r>
+    </w:p>
+    <w:p>
+      <w:pPr>
+        <w:rPr>
+          <w:b/>
+          <w:bCs/>
+        </w:rPr>
+      </w:pPr>
+      <w:r>
+        <w:rPr>
+          <w:b/>
+          <w:bCs/>
+        </w:rPr>
+        <w:t xml:space="preserve">Evidence </w:t>
+      </w:r>
+    </w:p>
+    <w:p>
+      <w:r>
+        <w:rPr>
+          <w:noProof/>
+        </w:rPr>
+        <w:drawing>
+          <wp:inline distT="0" distB="0" distL="0" distR="0" wp14:anchorId="5D351F24" wp14:editId="20CCF281">
+            <wp:extent cx="2535731" cy="1937337"/>
+            <wp:effectExtent l="0" t="0" r="0" b="6350"/>
+            <wp:docPr id="2050097270" name="Picture 4"/>
+            <wp:cNvGraphicFramePr>
+              <a:graphicFrameLocks xmlns:a="http://schemas.openxmlformats.org/drawingml/2006/main" noChangeAspect="1"/>
+            </wp:cNvGraphicFramePr>
+            <a:graphic xmlns:a="http://schemas.openxmlformats.org/drawingml/2006/main">
+              <a:graphicData uri="http://schemas.openxmlformats.org/drawingml/2006/picture">
+                <pic:pic xmlns:pic="http://schemas.openxmlformats.org/drawingml/2006/picture">
+                  <pic:nvPicPr>
+                    <pic:cNvPr id="0" name="Picture 5"/>
+                    <pic:cNvPicPr>
+                      <a:picLocks noChangeAspect="1" noChangeArrowheads="1"/>
+                    </pic:cNvPicPr>
+                  </pic:nvPicPr>
+                  <pic:blipFill>
+                    <a:blip r:embed="rId10" cstate="print">
+                      <a:extLst>
+                        <a:ext uri="{28A0092B-C50C-407E-A947-70E740481C1C}">
+                          <a14:useLocalDpi xmlns:a14="http://schemas.microsoft.com/office/drawing/2010/main" val="0"/>
+                        </a:ext>
+                      </a:extLst>
+                    </a:blip>
+                    <a:srcRect/>
+                    <a:stretch>
+                      <a:fillRect/>
+                    </a:stretch>
+                  </pic:blipFill>
+                  <pic:spPr bwMode="auto">
+                    <a:xfrm>
+                      <a:off x="0" y="0"/>
+                      <a:ext cx="2557477" cy="1953951"/>
+                    </a:xfrm>
+                    <a:prstGeom prst="rect">
+                      <a:avLst/>
+                    </a:prstGeom>
+                    <a:noFill/>
+                    <a:ln>
+                      <a:noFill/>
+                    </a:ln>
+                  </pic:spPr>
+                </pic:pic>
+              </a:graphicData>
+            </a:graphic>
+          </wp:inline>
+        </w:drawing>
+      </w:r>
+    </w:p>
+    <w:p>
+      <w:r>
+        <w:br w:type="page"/>
+      </w:r>
+    </w:p>
+    <w:p>
+      <w:pPr>
+        <w:pStyle w:val="Heading2"/>
+      </w:pPr>
+      <w:bookmarkStart w:id="10" w:name="_Toc233715761"/>
+      <w:r>
+        <w:lastRenderedPageBreak/>
+        <w:t>API-04</w:t>
+      </w:r>
+      <w:r>
+        <w:t xml:space="preserve"> - </w:t>
+      </w:r>
+      <w:r>
+        <w:t>Graceful Handling of Invalid Requests</w:t>
+      </w:r>
+      <w:bookmarkEnd w:id="10"/>
+    </w:p>
+    <w:p>
+      <w:pPr>
+        <w:rPr>
+          <w:b/>
+          <w:bCs/>
+        </w:rPr>
+      </w:pPr>
+      <w:r>
+        <w:rPr>
+          <w:b/>
+          <w:bCs/>
+        </w:rPr>
+        <w:t>Finding</w:t>
+      </w:r>
+    </w:p>
+    <w:p>
+      <w:r>
+        <w:t>A request for a non-existent resource returned an empty response rather than an application error.</w:t>
+      </w:r>
+      <w:r>
+        <w:t xml:space="preserve"> </w:t>
+      </w:r>
+    </w:p>
+    <w:p>
+      <w:pPr>
+        <w:rPr>
+          <w:b/>
+          <w:bCs/>
+        </w:rPr>
+      </w:pPr>
+      <w:r>
+        <w:rPr>
+          <w:b/>
+          <w:bCs/>
+        </w:rPr>
+        <w:t>Risk</w:t>
+      </w:r>
+    </w:p>
+    <w:p>
+      <w:r>
+        <w:t>Low</w:t>
+      </w:r>
+      <w:r>
+        <w:t xml:space="preserve"> </w:t>
+      </w:r>
+    </w:p>
+    <w:p>
+      <w:r>
+        <w:rPr>
+          <w:b/>
+          <w:bCs/>
+        </w:rPr>
+        <w:t>Description</w:t>
+      </w:r>
+      <w:r>
+        <w:t xml:space="preserve"> </w:t>
+      </w:r>
+    </w:p>
+    <w:p>
+      <w:r>
+        <w:t>The API handled invalid requests appropriately by returning an empty response instead of revealing internal application or database errors. Proper error handling prevents unnecessary information disclosure and improves application stability.</w:t>
+      </w:r>
+    </w:p>
+    <w:p>
+      <w:r>
+        <w:rPr>
+          <w:b/>
+          <w:bCs/>
+        </w:rPr>
+        <w:t>Business Impact</w:t>
+      </w:r>
+      <w:r>
+        <w:t xml:space="preserve"> </w:t>
+      </w:r>
+    </w:p>
+    <w:p>
+      <w:r>
+        <w:t>Well-managed error handling reduces the likelihood of attackers obtaining useful information about backend systems and improves the overall reliability of the application.</w:t>
+      </w:r>
+    </w:p>
+    <w:p>
+      <w:pPr>
+        <w:rPr>
+          <w:b/>
+          <w:bCs/>
+        </w:rPr>
+      </w:pPr>
+      <w:r>
+        <w:rPr>
+          <w:b/>
+          <w:bCs/>
+        </w:rPr>
+        <w:t>Recommendation</w:t>
+      </w:r>
+    </w:p>
+    <w:p>
+      <w:r>
+        <w:t>Continue implementing secure error handling practices and ensure error messages never expose internal application or database details.</w:t>
+      </w:r>
+    </w:p>
+    <w:p>
+      <w:pPr>
+        <w:rPr>
+          <w:b/>
+          <w:bCs/>
+        </w:rPr>
+      </w:pPr>
+      <w:r>
+        <w:rPr>
+          <w:b/>
+          <w:bCs/>
+        </w:rPr>
+        <w:t xml:space="preserve">Evidence </w:t>
+      </w:r>
+    </w:p>
+    <w:p>
+      <w:r>
+        <w:rPr>
+          <w:noProof/>
+        </w:rPr>
+        <w:drawing>
+          <wp:inline distT="0" distB="0" distL="0" distR="0" wp14:anchorId="7668E819" wp14:editId="71BAA806">
+            <wp:extent cx="2536440" cy="1944061"/>
+            <wp:effectExtent l="0" t="0" r="0" b="0"/>
+            <wp:docPr id="418192163" name="Picture 5"/>
+            <wp:cNvGraphicFramePr>
+              <a:graphicFrameLocks xmlns:a="http://schemas.openxmlformats.org/drawingml/2006/main" noChangeAspect="1"/>
+            </wp:cNvGraphicFramePr>
+            <a:graphic xmlns:a="http://schemas.openxmlformats.org/drawingml/2006/main">
+              <a:graphicData uri="http://schemas.openxmlformats.org/drawingml/2006/picture">
+                <pic:pic xmlns:pic="http://schemas.openxmlformats.org/drawingml/2006/picture">
+                  <pic:nvPicPr>
+                    <pic:cNvPr id="0" name="Picture 7"/>
+                    <pic:cNvPicPr>
+                      <a:picLocks noChangeAspect="1" noChangeArrowheads="1"/>
+                    </pic:cNvPicPr>
+                  </pic:nvPicPr>
+                  <pic:blipFill>
+                    <a:blip r:embed="rId11" cstate="print">
+                      <a:extLst>
+                        <a:ext uri="{28A0092B-C50C-407E-A947-70E740481C1C}">
+                          <a14:useLocalDpi xmlns:a14="http://schemas.microsoft.com/office/drawing/2010/main" val="0"/>
+                        </a:ext>
+                      </a:extLst>
+                    </a:blip>
+                    <a:srcRect/>
+                    <a:stretch>
+                      <a:fillRect/>
+                    </a:stretch>
+                  </pic:blipFill>
+                  <pic:spPr bwMode="auto">
+                    <a:xfrm>
+                      <a:off x="0" y="0"/>
+                      <a:ext cx="2546175" cy="1951522"/>
+                    </a:xfrm>
+                    <a:prstGeom prst="rect">
+                      <a:avLst/>
+                    </a:prstGeom>
+                    <a:noFill/>
+                    <a:ln>
+                      <a:noFill/>
+                    </a:ln>
+                  </pic:spPr>
+                </pic:pic>
+              </a:graphicData>
+            </a:graphic>
+          </wp:inline>
+        </w:drawing>
+      </w:r>
+    </w:p>
+    <w:p>
+      <w:r>
+        <w:br w:type="page"/>
+      </w:r>
+    </w:p>
+    <w:p>
+      <w:pPr>
+        <w:pStyle w:val="Heading2"/>
+      </w:pPr>
+      <w:bookmarkStart w:id="11" w:name="_Toc233715762"/>
+      <w:r>
+        <w:lastRenderedPageBreak/>
+        <w:t>API-05</w:t>
+      </w:r>
+      <w:r>
+        <w:t xml:space="preserve"> - </w:t>
+      </w:r>
+      <w:r>
+        <w:t>Response Header Analysis</w:t>
+      </w:r>
+      <w:bookmarkEnd w:id="11"/>
+    </w:p>
+    <w:p>
+      <w:r>
+        <w:rPr>
+          <w:b/>
+          <w:bCs/>
+        </w:rPr>
+        <w:t>Finding</w:t>
+      </w:r>
+      <w:r>
+        <w:t xml:space="preserve"> </w:t>
+      </w:r>
+    </w:p>
+    <w:p>
+      <w:r>
+        <w:t>Response headers were reviewed to determine whether unnecessary server information or sensitive metadata was disclosed.</w:t>
+      </w:r>
+    </w:p>
+    <w:p>
+      <w:r>
+        <w:rPr>
+          <w:b/>
+          <w:bCs/>
+        </w:rPr>
+        <w:t>Risk</w:t>
+      </w:r>
+      <w:r>
+        <w:t xml:space="preserve"> </w:t>
+      </w:r>
+    </w:p>
+    <w:p>
+      <w:r>
+        <w:t>Low</w:t>
+      </w:r>
+    </w:p>
+    <w:p>
+      <w:r>
+        <w:rPr>
+          <w:b/>
+          <w:bCs/>
+        </w:rPr>
+        <w:t>Description</w:t>
+      </w:r>
+      <w:r>
+        <w:t xml:space="preserve"> </w:t>
+      </w:r>
+    </w:p>
+    <w:p>
+      <w:r>
+        <w:t>The response headers contained standard HTTP information required for communication between the client and server. No significant information disclosure was identified during testing. Production APIs should continue minimising exposed server details wherever possible.</w:t>
+      </w:r>
+    </w:p>
+    <w:p>
+      <w:r>
+        <w:rPr>
+          <w:b/>
+          <w:bCs/>
+        </w:rPr>
+        <w:t>Business Impact</w:t>
+      </w:r>
+      <w:r>
+        <w:t xml:space="preserve"> </w:t>
+      </w:r>
+    </w:p>
+    <w:p>
+      <w:r>
+        <w:t>Reducing information available within HTTP headers limits the amount of technical information attackers can collect during reconnaissance.</w:t>
+      </w:r>
+    </w:p>
+    <w:p>
+      <w:pPr>
+        <w:tabs>
+          <w:tab w:val="left" w:pos="2832"/>
+        </w:tabs>
+        <w:rPr>
+          <w:b/>
+          <w:bCs/>
+        </w:rPr>
+      </w:pPr>
+      <w:r>
+        <w:rPr>
+          <w:b/>
+          <w:bCs/>
+        </w:rPr>
+        <w:t>Recommendation</w:t>
+      </w:r>
+      <w:r>
+        <w:rPr>
+          <w:b/>
+          <w:bCs/>
+        </w:rPr>
+        <w:tab/>
+      </w:r>
+    </w:p>
+    <w:p>
+      <w:pPr>
+        <w:tabs>
+          <w:tab w:val="left" w:pos="2832"/>
+        </w:tabs>
+      </w:pPr>
+      <w:r>
+        <w:t>Review response headers regularly and remove unnecessary server or framework information where possible. Continue implementing standard security headers to improve overall API security.</w:t>
+      </w:r>
+    </w:p>
+    <w:p>
+      <w:pPr>
+        <w:rPr>
+          <w:b/>
+          <w:bCs/>
+        </w:rPr>
+      </w:pPr>
+      <w:r>
+        <w:rPr>
+          <w:b/>
+          <w:bCs/>
+        </w:rPr>
+        <w:t xml:space="preserve">Evidence </w:t>
+      </w:r>
+    </w:p>
+    <w:p>
+      <w:r>
+        <w:rPr>
+          <w:noProof/>
+        </w:rPr>
+        <w:drawing>
+          <wp:inline distT="0" distB="0" distL="0" distR="0" wp14:anchorId="2019E0D3" wp14:editId="4E641D08">
+            <wp:extent cx="2526049" cy="1936376"/>
+            <wp:effectExtent l="0" t="0" r="7620" b="6985"/>
+            <wp:docPr id="427855573" name="Picture 11"/>
+            <wp:cNvGraphicFramePr>
+              <a:graphicFrameLocks xmlns:a="http://schemas.openxmlformats.org/drawingml/2006/main" noChangeAspect="1"/>
+            </wp:cNvGraphicFramePr>
+            <a:graphic xmlns:a="http://schemas.openxmlformats.org/drawingml/2006/main">
+              <a:graphicData uri="http://schemas.openxmlformats.org/drawingml/2006/picture">
+                <pic:pic xmlns:pic="http://schemas.openxmlformats.org/drawingml/2006/picture">
+                  <pic:nvPicPr>
+                    <pic:cNvPr id="0" name="Picture 19"/>
+                    <pic:cNvPicPr>
+                      <a:picLocks noChangeAspect="1" noChangeArrowheads="1"/>
+                    </pic:cNvPicPr>
+                  </pic:nvPicPr>
+                  <pic:blipFill>
+                    <a:blip r:embed="rId12" cstate="print">
+                      <a:extLst>
+                        <a:ext uri="{28A0092B-C50C-407E-A947-70E740481C1C}">
+                          <a14:useLocalDpi xmlns:a14="http://schemas.microsoft.com/office/drawing/2010/main" val="0"/>
+                        </a:ext>
+                      </a:extLst>
+                    </a:blip>
+                    <a:srcRect/>
+                    <a:stretch>
+                      <a:fillRect/>
+                    </a:stretch>
+                  </pic:blipFill>
+                  <pic:spPr bwMode="auto">
+                    <a:xfrm>
+                      <a:off x="0" y="0"/>
+                      <a:ext cx="2537490" cy="1945146"/>
+                    </a:xfrm>
+                    <a:prstGeom prst="rect">
+                      <a:avLst/>
+                    </a:prstGeom>
+                    <a:noFill/>
+                    <a:ln>
+                      <a:noFill/>
+                    </a:ln>
+                  </pic:spPr>
+                </pic:pic>
+              </a:graphicData>
+            </a:graphic>
+          </wp:inline>
+        </w:drawing>
+      </w:r>
+    </w:p>
+    <w:p>
+      <w:r>
+        <w:br w:type="page"/>
+      </w:r>
+    </w:p>
+    <w:p>
+      <w:pPr>
+        <w:pStyle w:val="Heading1"/>
+        <w:rPr>
+          <w:b/>
+          <w:bCs/>
+        </w:rPr>
+      </w:pPr>
+      <w:bookmarkStart w:id="12" w:name="_Toc233715763"/>
+      <w:r>
+        <w:rPr>
+          <w:b/>
+          <w:bCs/>
+        </w:rPr>
+        <w:lastRenderedPageBreak/>
+        <w:t>8. Overall Risk Summary</w:t>
+      </w:r>
+      <w:bookmarkEnd w:id="12"/>
+    </w:p>
+    <w:tbl>
+      <w:tblPr>
+        <w:tblStyle w:val="TableGrid"/>
+        <w:tblW w:w="0" w:type="auto"/>
+        <w:tblLook w:val="04A0" w:firstRow="1" w:lastRow="0" w:firstColumn="1" w:lastColumn="0" w:noHBand="0" w:noVBand="1"/>
+      </w:tblPr>
+      <w:tblGrid>
+        <w:gridCol w:w="4985"/>
+        <w:gridCol w:w="1063"/>
+      </w:tblGrid>
+      <w:tr>
+        <w:tc>
+          <w:tcPr>
+            <w:tcW w:w="0" w:type="auto"/>
+            <w:hideMark/>
+          </w:tcPr>
+          <w:p>
+            <w:pPr>
+              <w:spacing w:after="160" w:line="278" w:lineRule="auto"/>
+              <w:rPr>
+                <w:b/>
+                <w:bCs/>
+              </w:rPr>
+            </w:pPr>
+            <w:r>
+              <w:rPr>
+                <w:b/>
+                <w:bCs/>
+              </w:rPr>
+              <w:t>Finding</w:t>
+            </w:r>
+          </w:p>
+        </w:tc>
+        <w:tc>
+          <w:tcPr>
+            <w:tcW w:w="0" w:type="auto"/>
+            <w:hideMark/>
+          </w:tcPr>
+          <w:p>
+            <w:pPr>
+              <w:spacing w:after="160" w:line="278" w:lineRule="auto"/>
+              <w:rPr>
+                <w:b/>
+                <w:bCs/>
+              </w:rPr>
+            </w:pPr>
+            <w:r>
+              <w:rPr>
+                <w:b/>
+                <w:bCs/>
+              </w:rPr>
+              <w:t>Risk</w:t>
+            </w:r>
+          </w:p>
+        </w:tc>
+      </w:tr>
+      <w:tr>
+        <w:tc>
+          <w:tcPr>
+            <w:tcW w:w="0" w:type="auto"/>
+            <w:hideMark/>
+          </w:tcPr>
+          <w:p>
+            <w:pPr>
+              <w:spacing w:after="160" w:line="278" w:lineRule="auto"/>
+            </w:pPr>
+            <w:r>
+              <w:t>API-01 – Unauthenticated Endpoint</w:t>
+            </w:r>
+          </w:p>
+        </w:tc>
+        <w:tc>
+          <w:tcPr>
+            <w:tcW w:w="0" w:type="auto"/>
+            <w:hideMark/>
+          </w:tcPr>
+          <w:p>
+            <w:pPr>
+              <w:spacing w:after="160" w:line="278" w:lineRule="auto"/>
+            </w:pPr>
+            <w:r>
+              <w:t>Medium</w:t>
+            </w:r>
+          </w:p>
+        </w:tc>
+      </w:tr>
+      <w:tr>
+        <w:tc>
+          <w:tcPr>
+            <w:tcW w:w="0" w:type="auto"/>
+            <w:hideMark/>
+          </w:tcPr>
+          <w:p>
+            <w:pPr>
+              <w:spacing w:after="160" w:line="278" w:lineRule="auto"/>
+            </w:pPr>
+            <w:r>
+              <w:t>API-02 – Excessive Data Exposure</w:t>
+            </w:r>
+          </w:p>
+        </w:tc>
+        <w:tc>
+          <w:tcPr>
+            <w:tcW w:w="0" w:type="auto"/>
+            <w:hideMark/>
+          </w:tcPr>
+          <w:p>
+            <w:pPr>
+              <w:spacing w:after="160" w:line="278" w:lineRule="auto"/>
+            </w:pPr>
+            <w:r>
+              <w:t>Medium</w:t>
+            </w:r>
+          </w:p>
+        </w:tc>
+      </w:tr>
+      <w:tr>
+        <w:tc>
+          <w:tcPr>
+            <w:tcW w:w="0" w:type="auto"/>
+            <w:hideMark/>
+          </w:tcPr>
+          <w:p>
+            <w:pPr>
+              <w:spacing w:after="160" w:line="278" w:lineRule="auto"/>
+            </w:pPr>
+            <w:r>
+              <w:t>API-03 – Information Disclosure</w:t>
+            </w:r>
+          </w:p>
+        </w:tc>
+        <w:tc>
+          <w:tcPr>
+            <w:tcW w:w="0" w:type="auto"/>
+            <w:hideMark/>
+          </w:tcPr>
+          <w:p>
+            <w:pPr>
+              <w:spacing w:after="160" w:line="278" w:lineRule="auto"/>
+            </w:pPr>
+            <w:r>
+              <w:t>Low</w:t>
+            </w:r>
+          </w:p>
+        </w:tc>
+      </w:tr>
+      <w:tr>
+        <w:tc>
+          <w:tcPr>
+            <w:tcW w:w="0" w:type="auto"/>
+            <w:hideMark/>
+          </w:tcPr>
+          <w:p>
+            <w:pPr>
+              <w:spacing w:after="160" w:line="278" w:lineRule="auto"/>
+            </w:pPr>
+            <w:r>
+              <w:t>API-04 – Graceful Handling of Invalid Requests</w:t>
+            </w:r>
+          </w:p>
+        </w:tc>
+        <w:tc>
+          <w:tcPr>
+            <w:tcW w:w="0" w:type="auto"/>
+            <w:hideMark/>
+          </w:tcPr>
+          <w:p>
+            <w:pPr>
+              <w:spacing w:after="160" w:line="278" w:lineRule="auto"/>
+            </w:pPr>
+            <w:r>
+              <w:t>Low</w:t>
+            </w:r>
+          </w:p>
+        </w:tc>
+      </w:tr>
+      <w:tr>
+        <w:tc>
+          <w:tcPr>
+            <w:tcW w:w="0" w:type="auto"/>
+            <w:hideMark/>
+          </w:tcPr>
+          <w:p>
+            <w:pPr>
+              <w:spacing w:after="160" w:line="278" w:lineRule="auto"/>
+            </w:pPr>
+            <w:r>
+              <w:t>API-05 – Response Header Analysis</w:t>
+            </w:r>
+          </w:p>
+        </w:tc>
+        <w:tc>
+          <w:tcPr>
+            <w:tcW w:w="0" w:type="auto"/>
+            <w:hideMark/>
+          </w:tcPr>
+          <w:p>
+            <w:pPr>
+              <w:spacing w:after="160" w:line="278" w:lineRule="auto"/>
+            </w:pPr>
+            <w:r>
+              <w:t>Low</w:t>
+            </w:r>
+          </w:p>
+        </w:tc>
+      </w:tr>
+    </w:tbl>
+    <w:p/>
+    <w:p>
+      <w:r>
+        <w:t xml:space="preserve">Overall Risk Rating: </w:t>
+      </w:r>
+      <w:r>
+        <w:rPr>
+          <w:b/>
+          <w:bCs/>
+        </w:rPr>
+        <w:t>Medium</w:t>
+      </w:r>
+    </w:p>
+    <w:p>
+      <w:r>
+        <w:t>Although the assessed API is intentionally public and intended for educational use, the identified findings demonstrate security considerations that organisations should address when developing production APIs containing sensitive information.</w:t>
+      </w:r>
+    </w:p>
+    <w:p>
+      <w:pPr>
+        <w:pStyle w:val="Heading1"/>
+        <w:rPr>
+          <w:b/>
+          <w:bCs/>
+        </w:rPr>
+      </w:pPr>
+      <w:bookmarkStart w:id="13" w:name="_Toc233715764"/>
+      <w:r>
+        <w:rPr>
+          <w:b/>
+          <w:bCs/>
+        </w:rPr>
+        <w:t>9.</w:t>
+      </w:r>
+      <w:r>
+        <w:rPr>
+          <w:b/>
+          <w:bCs/>
+        </w:rPr>
+        <w:t>Recommendations</w:t>
+      </w:r>
+      <w:bookmarkEnd w:id="13"/>
+    </w:p>
+    <w:p>
+      <w:pPr>
+        <w:pStyle w:val="ListParagraph"/>
+        <w:numPr>
+          <w:ilvl w:val="0"/>
+          <w:numId w:val="1"/>
+        </w:numPr>
+      </w:pPr>
+      <w:r>
+        <w:t xml:space="preserve">Implement authentication for sensitive API endpoints. </w:t>
+      </w:r>
+    </w:p>
+    <w:p>
+      <w:pPr>
+        <w:pStyle w:val="ListParagraph"/>
+        <w:numPr>
+          <w:ilvl w:val="0"/>
+          <w:numId w:val="1"/>
+        </w:numPr>
+      </w:pPr>
+      <w:r>
+        <w:t xml:space="preserve">Limit data returned within API responses to only what is necessary. </w:t>
+      </w:r>
+    </w:p>
+    <w:p>
+      <w:pPr>
+        <w:pStyle w:val="ListParagraph"/>
+        <w:numPr>
+          <w:ilvl w:val="0"/>
+          <w:numId w:val="1"/>
+        </w:numPr>
+      </w:pPr>
+      <w:r>
+        <w:t xml:space="preserve">Apply the principle of least privilege. </w:t>
+      </w:r>
+    </w:p>
+    <w:p>
+      <w:pPr>
+        <w:pStyle w:val="ListParagraph"/>
+        <w:numPr>
+          <w:ilvl w:val="0"/>
+          <w:numId w:val="1"/>
+        </w:numPr>
+      </w:pPr>
+      <w:r>
+        <w:t xml:space="preserve">Review response headers to minimise unnecessary information disclosure. </w:t>
+      </w:r>
+    </w:p>
+    <w:p>
+      <w:pPr>
+        <w:pStyle w:val="ListParagraph"/>
+        <w:numPr>
+          <w:ilvl w:val="0"/>
+          <w:numId w:val="1"/>
+        </w:numPr>
+      </w:pPr>
+      <w:r>
+        <w:t xml:space="preserve">Continue implementing secure error handling practices. </w:t>
+      </w:r>
+    </w:p>
+    <w:p>
+      <w:pPr>
+        <w:pStyle w:val="ListParagraph"/>
+        <w:numPr>
+          <w:ilvl w:val="0"/>
+          <w:numId w:val="1"/>
+        </w:numPr>
+      </w:pPr>
+      <w:r>
+        <w:t>Perform regular API security assessments throughout the software development lifecycle.</w:t>
+      </w:r>
+    </w:p>
+    <w:p>
+      <w:pPr>
+        <w:pStyle w:val="Heading1"/>
+        <w:rPr>
+          <w:b/>
+          <w:bCs/>
+        </w:rPr>
+      </w:pPr>
+      <w:bookmarkStart w:id="14" w:name="_Toc233715765"/>
+      <w:r>
+        <w:rPr>
+          <w:b/>
+          <w:bCs/>
+        </w:rPr>
+        <w:t>10. Conclusion</w:t>
+      </w:r>
+      <w:bookmarkEnd w:id="14"/>
+    </w:p>
+    <w:p>
+      <w:r>
+        <w:t xml:space="preserve">This assessment demonstrated how API security reviews help identify potential risks before they become security incidents. Although </w:t>
+      </w:r>
+      <w:proofErr w:type="spellStart"/>
+      <w:r>
+        <w:t>JSONPlaceholder</w:t>
+      </w:r>
+      <w:proofErr w:type="spellEnd"/>
+      <w:r>
+        <w:t xml:space="preserve"> is designed as a public testing API, the findings illustrate common security issues that should be carefully managed in production environments. Regular API security testing, combined with secure development practices, helps organisations protect sensitive data, strengthen customer trust and reduce overall cyber security risk.</w:t>
+      </w:r>
+    </w:p>
+    <w:p>
+      <w:pPr>
+        <w:pStyle w:val="Heading1"/>
+        <w:rPr>
+          <w:b/>
+          <w:bCs/>
+        </w:rPr>
+      </w:pPr>
+      <w:bookmarkStart w:id="15" w:name="_Toc233715766"/>
+      <w:r>
+        <w:rPr>
+          <w:b/>
+          <w:bCs/>
+        </w:rPr>
+        <w:t>11. References</w:t>
+      </w:r>
+      <w:bookmarkEnd w:id="15"/>
+    </w:p>
+    <w:p>
+      <w:pPr>
+        <w:pStyle w:val="ListParagraph"/>
+        <w:numPr>
+          <w:ilvl w:val="0"/>
+          <w:numId w:val="1"/>
+        </w:numPr>
+      </w:pPr>
+      <w:proofErr w:type="spellStart"/>
+      <w:r>
+        <w:t>JSONPlaceholder</w:t>
+      </w:r>
+      <w:proofErr w:type="spellEnd"/>
+      <w:r>
+        <w:t xml:space="preserve">. </w:t>
+      </w:r>
+      <w:r>
+        <w:rPr>
+          <w:i/>
+          <w:iCs/>
+        </w:rPr>
+        <w:t>Fake Online REST API for Testing and Prototyping.</w:t>
+      </w:r>
+      <w:r>
+        <w:t xml:space="preserve"> </w:t>
+      </w:r>
+      <w:hyperlink r:id="rId13" w:tgtFrame="_new" w:history="1">
+        <w:r>
+          <w:rPr>
+            <w:rStyle w:val="Hyperlink"/>
+          </w:rPr>
+          <w:t>https://jsonplaceholder.typicode.com</w:t>
+        </w:r>
+      </w:hyperlink>
+      <w:r>
+        <w:t xml:space="preserve"> </w:t>
+      </w:r>
+    </w:p>
+    <w:p>
+      <w:pPr>
+        <w:pStyle w:val="ListParagraph"/>
+        <w:numPr>
+          <w:ilvl w:val="0"/>
+          <w:numId w:val="1"/>
+        </w:numPr>
+      </w:pPr>
+      <w:r>
+        <w:lastRenderedPageBreak/>
+        <w:t xml:space="preserve">Postman. </w:t>
+      </w:r>
+      <w:r>
+        <w:rPr>
+          <w:i/>
+          <w:iCs/>
+        </w:rPr>
+        <w:t>API Platform for Building and Using APIs.</w:t>
+      </w:r>
+      <w:r>
+        <w:t xml:space="preserve"> </w:t>
+      </w:r>
+      <w:hyperlink r:id="rId14" w:tgtFrame="_new" w:history="1">
+        <w:r>
+          <w:rPr>
+            <w:rStyle w:val="Hyperlink"/>
+          </w:rPr>
+          <w:t>https://www.postman.com</w:t>
+        </w:r>
+      </w:hyperlink>
+      <w:r>
+        <w:t xml:space="preserve"> </w:t>
+      </w:r>
+    </w:p>
+    <w:p>
+      <w:pPr>
+        <w:pStyle w:val="ListParagraph"/>
+        <w:numPr>
+          <w:ilvl w:val="0"/>
+          <w:numId w:val="1"/>
+        </w:numPr>
+      </w:pPr>
+      <w:r>
+        <w:t xml:space="preserve">OWASP Foundation. </w:t>
+      </w:r>
+      <w:r>
+        <w:rPr>
+          <w:i/>
+          <w:iCs/>
+        </w:rPr>
+        <w:t>OWASP API Security Top 10.</w:t>
+      </w:r>
+      <w:r>
+        <w:t xml:space="preserve"> </w:t>
+      </w:r>
+      <w:hyperlink r:id="rId15" w:tgtFrame="_new" w:history="1">
+        <w:r>
+          <w:rPr>
+            <w:rStyle w:val="Hyperlink"/>
+          </w:rPr>
+          <w:t>https://owasp.org/API-Security/</w:t>
+        </w:r>
+      </w:hyperlink>
+      <w:r>
+        <w:t xml:space="preserve"> </w:t>
+      </w:r>
+    </w:p>
+    <w:p>
+      <w:pPr>
+        <w:pStyle w:val="ListParagraph"/>
+        <w:numPr>
+          <w:ilvl w:val="0"/>
+          <w:numId w:val="1"/>
+        </w:numPr>
+      </w:pPr>
+      <w:r>
+        <w:t>Browser Developer Tools (Google Chrome)</w:t>
+      </w:r>
+    </w:p>
+    <w:p>
+      <w:pPr>
+        <w:pStyle w:val="Heading1"/>
+        <w:rPr>
+          <w:b/>
+          <w:bCs/>
+        </w:rPr>
+      </w:pPr>
+      <w:bookmarkStart w:id="16" w:name="_Toc233715767"/>
+      <w:r>
+        <w:rPr>
+          <w:b/>
+          <w:bCs/>
+        </w:rPr>
+        <w:t>12. Appendices</w:t>
+      </w:r>
+      <w:bookmarkEnd w:id="16"/>
+    </w:p>
+    <w:p>
+      <w:pPr>
+        <w:rPr>
+          <w:b/>
+          <w:bCs/>
+        </w:rPr>
+      </w:pPr>
+      <w:r>
+        <w:rPr>
+          <w:b/>
+          <w:bCs/>
+        </w:rPr>
+        <w:t>Appendix A – API-01_GET_Posts_Unauthenticated</w:t>
+      </w:r>
+    </w:p>
+    <w:p>
+      <w:r>
+        <w:rPr>
+          <w:noProof/>
+        </w:rPr>
+        <w:drawing>
+          <wp:inline distT="0" distB="0" distL="0" distR="0" wp14:anchorId="1BE189B4" wp14:editId="4FC9C04A">
+            <wp:extent cx="3935710" cy="3002145"/>
+            <wp:effectExtent l="0" t="0" r="8255" b="8255"/>
+            <wp:docPr id="935569340" name="Picture 6"/>
+            <wp:cNvGraphicFramePr>
+              <a:graphicFrameLocks xmlns:a="http://schemas.openxmlformats.org/drawingml/2006/main" noChangeAspect="1"/>
+            </wp:cNvGraphicFramePr>
+            <a:graphic xmlns:a="http://schemas.openxmlformats.org/drawingml/2006/main">
+              <a:graphicData uri="http://schemas.openxmlformats.org/drawingml/2006/picture">
+                <pic:pic xmlns:pic="http://schemas.openxmlformats.org/drawingml/2006/picture">
+                  <pic:nvPicPr>
+                    <pic:cNvPr id="0" name="Picture 9"/>
+                    <pic:cNvPicPr>
+                      <a:picLocks noChangeAspect="1" noChangeArrowheads="1"/>
+                    </pic:cNvPicPr>
+                  </pic:nvPicPr>
+                  <pic:blipFill>
+                    <a:blip r:embed="rId16" cstate="print">
+                      <a:extLst>
+                        <a:ext uri="{28A0092B-C50C-407E-A947-70E740481C1C}">
+                          <a14:useLocalDpi xmlns:a14="http://schemas.microsoft.com/office/drawing/2010/main" val="0"/>
+                        </a:ext>
+                      </a:extLst>
+                    </a:blip>
+                    <a:srcRect/>
+                    <a:stretch>
+                      <a:fillRect/>
+                    </a:stretch>
+                  </pic:blipFill>
+                  <pic:spPr bwMode="auto">
+                    <a:xfrm>
+                      <a:off x="0" y="0"/>
+                      <a:ext cx="3943826" cy="3008336"/>
+                    </a:xfrm>
+                    <a:prstGeom prst="rect">
+                      <a:avLst/>
+                    </a:prstGeom>
+                    <a:noFill/>
+                    <a:ln>
+                      <a:noFill/>
+                    </a:ln>
+                  </pic:spPr>
+                </pic:pic>
+              </a:graphicData>
+            </a:graphic>
+          </wp:inline>
+        </w:drawing>
+      </w:r>
+    </w:p>
+    <w:p>
+      <w:pPr>
+        <w:rPr>
+          <w:b/>
+          <w:bCs/>
+        </w:rPr>
+      </w:pPr>
+      <w:r>
+        <w:rPr>
+          <w:b/>
+          <w:bCs/>
+        </w:rPr>
+        <w:t>Appendix B – API-02_GET_Users_Data_Exposure</w:t>
+      </w:r>
+    </w:p>
+    <w:p>
+      <w:r>
+        <w:rPr>
+          <w:noProof/>
+        </w:rPr>
+        <w:drawing>
+          <wp:inline distT="0" distB="0" distL="0" distR="0" wp14:anchorId="42DF1BB3" wp14:editId="640C87FC">
+            <wp:extent cx="3920693" cy="3010237"/>
+            <wp:effectExtent l="0" t="0" r="3810" b="0"/>
+            <wp:docPr id="832123195" name="Picture 7"/>
+            <wp:cNvGraphicFramePr>
+              <a:graphicFrameLocks xmlns:a="http://schemas.openxmlformats.org/drawingml/2006/main" noChangeAspect="1"/>
+            </wp:cNvGraphicFramePr>
+            <a:graphic xmlns:a="http://schemas.openxmlformats.org/drawingml/2006/main">
+              <a:graphicData uri="http://schemas.openxmlformats.org/drawingml/2006/picture">
+                <pic:pic xmlns:pic="http://schemas.openxmlformats.org/drawingml/2006/picture">
+                  <pic:nvPicPr>
+                    <pic:cNvPr id="0" name="Picture 11"/>
+                    <pic:cNvPicPr>
+                      <a:picLocks noChangeAspect="1" noChangeArrowheads="1"/>
+                    </pic:cNvPicPr>
+                  </pic:nvPicPr>
+                  <pic:blipFill>
+                    <a:blip r:embed="rId17" cstate="print">
+                      <a:extLst>
+                        <a:ext uri="{28A0092B-C50C-407E-A947-70E740481C1C}">
+                          <a14:useLocalDpi xmlns:a14="http://schemas.microsoft.com/office/drawing/2010/main" val="0"/>
+                        </a:ext>
+                      </a:extLst>
+                    </a:blip>
+                    <a:srcRect/>
+                    <a:stretch>
+                      <a:fillRect/>
+                    </a:stretch>
+                  </pic:blipFill>
+                  <pic:spPr bwMode="auto">
+                    <a:xfrm>
+                      <a:off x="0" y="0"/>
+                      <a:ext cx="3935240" cy="3021406"/>
+                    </a:xfrm>
+                    <a:prstGeom prst="rect">
+                      <a:avLst/>
+                    </a:prstGeom>
+                    <a:noFill/>
+                    <a:ln>
+                      <a:noFill/>
+                    </a:ln>
+                  </pic:spPr>
+                </pic:pic>
+              </a:graphicData>
+            </a:graphic>
+          </wp:inline>
+        </w:drawing>
+      </w:r>
+    </w:p>
+    <w:p>
+      <w:pPr>
+        <w:rPr>
+          <w:b/>
+          <w:bCs/>
+        </w:rPr>
+      </w:pPr>
+      <w:r>
+        <w:rPr>
+          <w:b/>
+          <w:bCs/>
+        </w:rPr>
+        <w:t>Appendix C – API-03_GET_Post_Single_Record</w:t>
+      </w:r>
+    </w:p>
+    <w:p>
+      <w:r>
+        <w:rPr>
+          <w:noProof/>
+        </w:rPr>
+        <w:lastRenderedPageBreak/>
+        <w:drawing>
+          <wp:inline distT="0" distB="0" distL="0" distR="0" wp14:anchorId="49466A03" wp14:editId="425F7B5D">
+            <wp:extent cx="3920490" cy="2995313"/>
+            <wp:effectExtent l="0" t="0" r="3810" b="0"/>
+            <wp:docPr id="1400641453" name="Picture 8"/>
+            <wp:cNvGraphicFramePr>
+              <a:graphicFrameLocks xmlns:a="http://schemas.openxmlformats.org/drawingml/2006/main" noChangeAspect="1"/>
+            </wp:cNvGraphicFramePr>
+            <a:graphic xmlns:a="http://schemas.openxmlformats.org/drawingml/2006/main">
+              <a:graphicData uri="http://schemas.openxmlformats.org/drawingml/2006/picture">
+                <pic:pic xmlns:pic="http://schemas.openxmlformats.org/drawingml/2006/picture">
+                  <pic:nvPicPr>
+                    <pic:cNvPr id="0" name="Picture 13"/>
+                    <pic:cNvPicPr>
+                      <a:picLocks noChangeAspect="1" noChangeArrowheads="1"/>
+                    </pic:cNvPicPr>
+                  </pic:nvPicPr>
+                  <pic:blipFill>
+                    <a:blip r:embed="rId18" cstate="print">
+                      <a:extLst>
+                        <a:ext uri="{28A0092B-C50C-407E-A947-70E740481C1C}">
+                          <a14:useLocalDpi xmlns:a14="http://schemas.microsoft.com/office/drawing/2010/main" val="0"/>
+                        </a:ext>
+                      </a:extLst>
+                    </a:blip>
+                    <a:srcRect/>
+                    <a:stretch>
+                      <a:fillRect/>
+                    </a:stretch>
+                  </pic:blipFill>
+                  <pic:spPr bwMode="auto">
+                    <a:xfrm>
+                      <a:off x="0" y="0"/>
+                      <a:ext cx="3927078" cy="3000346"/>
+                    </a:xfrm>
+                    <a:prstGeom prst="rect">
+                      <a:avLst/>
+                    </a:prstGeom>
+                    <a:noFill/>
+                    <a:ln>
+                      <a:noFill/>
+                    </a:ln>
+                  </pic:spPr>
+                </pic:pic>
+              </a:graphicData>
+            </a:graphic>
+          </wp:inline>
+        </w:drawing>
+      </w:r>
+    </w:p>
+    <w:p>
+      <w:pPr>
+        <w:rPr>
+          <w:b/>
+          <w:bCs/>
+        </w:rPr>
+      </w:pPr>
+      <w:r>
+        <w:rPr>
+          <w:b/>
+          <w:bCs/>
+        </w:rPr>
+        <w:t>Appendix D – API-04_Invalid_Request_Response</w:t>
+      </w:r>
+    </w:p>
+    <w:p>
+      <w:r>
+        <w:rPr>
+          <w:noProof/>
+        </w:rPr>
+        <w:drawing>
+          <wp:inline distT="0" distB="0" distL="0" distR="0" wp14:anchorId="506969F9" wp14:editId="01BCC85E">
+            <wp:extent cx="3948913" cy="3026654"/>
+            <wp:effectExtent l="0" t="0" r="0" b="2540"/>
+            <wp:docPr id="1982120531" name="Picture 9"/>
+            <wp:cNvGraphicFramePr>
+              <a:graphicFrameLocks xmlns:a="http://schemas.openxmlformats.org/drawingml/2006/main" noChangeAspect="1"/>
+            </wp:cNvGraphicFramePr>
+            <a:graphic xmlns:a="http://schemas.openxmlformats.org/drawingml/2006/main">
+              <a:graphicData uri="http://schemas.openxmlformats.org/drawingml/2006/picture">
+                <pic:pic xmlns:pic="http://schemas.openxmlformats.org/drawingml/2006/picture">
+                  <pic:nvPicPr>
+                    <pic:cNvPr id="0" name="Picture 15"/>
+                    <pic:cNvPicPr>
+                      <a:picLocks noChangeAspect="1" noChangeArrowheads="1"/>
+                    </pic:cNvPicPr>
+                  </pic:nvPicPr>
+                  <pic:blipFill>
+                    <a:blip r:embed="rId19" cstate="print">
+                      <a:extLst>
+                        <a:ext uri="{28A0092B-C50C-407E-A947-70E740481C1C}">
+                          <a14:useLocalDpi xmlns:a14="http://schemas.microsoft.com/office/drawing/2010/main" val="0"/>
+                        </a:ext>
+                      </a:extLst>
+                    </a:blip>
+                    <a:srcRect/>
+                    <a:stretch>
+                      <a:fillRect/>
+                    </a:stretch>
+                  </pic:blipFill>
+                  <pic:spPr bwMode="auto">
+                    <a:xfrm>
+                      <a:off x="0" y="0"/>
+                      <a:ext cx="3957702" cy="3033390"/>
+                    </a:xfrm>
+                    <a:prstGeom prst="rect">
+                      <a:avLst/>
+                    </a:prstGeom>
+                    <a:noFill/>
+                    <a:ln>
+                      <a:noFill/>
+                    </a:ln>
+                  </pic:spPr>
+                </pic:pic>
+              </a:graphicData>
+            </a:graphic>
+          </wp:inline>
+        </w:drawing>
+      </w:r>
+    </w:p>
+    <w:p>
+      <w:pPr>
+        <w:rPr>
+          <w:b/>
+          <w:bCs/>
+        </w:rPr>
+      </w:pPr>
+    </w:p>
+    <w:p>
+      <w:pPr>
+        <w:rPr>
+          <w:b/>
+          <w:bCs/>
+        </w:rPr>
+      </w:pPr>
+    </w:p>
+    <w:p>
+      <w:pPr>
+        <w:rPr>
+          <w:b/>
+          <w:bCs/>
+        </w:rPr>
+      </w:pPr>
+    </w:p>
+    <w:p>
+      <w:pPr>
+        <w:rPr>
+          <w:b/>
+          <w:bCs/>
+        </w:rPr>
+      </w:pPr>
+    </w:p>
+    <w:p>
+      <w:pPr>
+        <w:rPr>
+          <w:b/>
+          <w:bCs/>
+        </w:rPr>
+      </w:pPr>
+    </w:p>
+    <w:p>
+      <w:pPr>
+        <w:rPr>
+          <w:b/>
+          <w:bCs/>
+        </w:rPr>
+      </w:pPr>
+    </w:p>
+    <w:p>
+      <w:pPr>
+        <w:rPr>
+          <w:b/>
+          <w:bCs/>
+        </w:rPr>
+      </w:pPr>
+    </w:p>
+    <w:p>
+      <w:pPr>
+        <w:rPr>
+          <w:b/>
+          <w:bCs/>
+        </w:rPr>
+      </w:pPr>
+      <w:r>
+        <w:rPr>
+          <w:b/>
+          <w:bCs/>
+        </w:rPr>
+        <w:lastRenderedPageBreak/>
+        <w:t>Appendix E – API-05_Response_Headers</w:t>
+      </w:r>
+    </w:p>
+    <w:p>
+      <w:r>
+        <w:rPr>
+          <w:noProof/>
+        </w:rPr>
+        <w:drawing>
+          <wp:inline distT="0" distB="0" distL="0" distR="0" wp14:anchorId="1FEE3609" wp14:editId="1136E35B">
+            <wp:extent cx="3948430" cy="3027596"/>
+            <wp:effectExtent l="0" t="0" r="0" b="1905"/>
+            <wp:docPr id="972468238" name="Picture 10"/>
+            <wp:cNvGraphicFramePr>
+              <a:graphicFrameLocks xmlns:a="http://schemas.openxmlformats.org/drawingml/2006/main" noChangeAspect="1"/>
+            </wp:cNvGraphicFramePr>
+            <a:graphic xmlns:a="http://schemas.openxmlformats.org/drawingml/2006/main">
+              <a:graphicData uri="http://schemas.openxmlformats.org/drawingml/2006/picture">
+                <pic:pic xmlns:pic="http://schemas.openxmlformats.org/drawingml/2006/picture">
+                  <pic:nvPicPr>
+                    <pic:cNvPr id="0" name="Picture 17"/>
+                    <pic:cNvPicPr>
+                      <a:picLocks noChangeAspect="1" noChangeArrowheads="1"/>
+                    </pic:cNvPicPr>
+                  </pic:nvPicPr>
+                  <pic:blipFill>
+                    <a:blip r:embed="rId20" cstate="print">
+                      <a:extLst>
+                        <a:ext uri="{28A0092B-C50C-407E-A947-70E740481C1C}">
+                          <a14:useLocalDpi xmlns:a14="http://schemas.microsoft.com/office/drawing/2010/main" val="0"/>
+                        </a:ext>
+                      </a:extLst>
+                    </a:blip>
+                    <a:srcRect/>
+                    <a:stretch>
+                      <a:fillRect/>
+                    </a:stretch>
+                  </pic:blipFill>
+                  <pic:spPr bwMode="auto">
+                    <a:xfrm>
+                      <a:off x="0" y="0"/>
+                      <a:ext cx="3960970" cy="3037212"/>
+                    </a:xfrm>
+                    <a:prstGeom prst="rect">
+                      <a:avLst/>
+                    </a:prstGeom>
+                    <a:noFill/>
+                    <a:ln>
+                      <a:noFill/>
+                    </a:ln>
+                  </pic:spPr>
+                </pic:pic>
+              </a:graphicData>
+            </a:graphic>
+          </wp:inline>
+        </w:drawing>
+      </w:r>
+    </w:p>
     <w:sectPr>
+      <w:footerReference w:type="default" r:id="rId21"/>
       <w:pgSz w:w="11906" w:h="16838"/>
-      <w:pgMar w:top="1440" w:right="1440" w:bottom="1440" w:left="1440" w:header="708" w:footer="708" w:gutter="0"/>
+      <w:pgMar w:top="1440" w:right="1440" w:bottom="1440" w:left="1440" w:header="709" w:footer="709" w:gutter="0"/>
+      <w:pgBorders w:display="notFirstPage" w:offsetFrom="page">
+        <w:top w:val="single" w:sz="4" w:space="24" w:color="auto"/>
+        <w:left w:val="single" w:sz="4" w:space="24" w:color="auto"/>
+        <w:bottom w:val="single" w:sz="4" w:space="24" w:color="auto"/>
+        <w:right w:val="single" w:sz="4" w:space="24" w:color="auto"/>
+      </w:pgBorders>
       <w:cols w:space="708"/>
       <w:docGrid w:linePitch="360"/>
     </w:sectPr>
   </w:body>
 </w:document>
+</file>
+
+<file path=word/endnotes.xml><?xml version="1.0" encoding="utf-8"?>
+<w:endnotes xmlns:wpc="http://schemas.microsoft.com/office/word/2010/wordprocessingCanvas" xmlns:cx="http://schemas.microsoft.com/office/drawing/2014/chartex" xmlns:cx1="http://schemas.microsoft.com/office/drawing/2015/9/8/chartex" xmlns:cx2="http://schemas.microsoft.com/office/drawing/2015/10/21/chartex" xmlns:cx3="http://schemas.microsoft.com/office/drawing/2016/5/9/chartex" xmlns:cx4="http://schemas.microsoft.com/office/drawing/2016/5/10/chartex" xmlns:cx5="http://schemas.microsoft.com/office/drawing/2016/5/11/chartex" xmlns:cx6="http://schemas.microsoft.com/office/drawing/2016/5/12/chartex" xmlns:cx7="http://schemas.microsoft.com/office/drawing/2016/5/13/chartex" xmlns:cx8="http://schemas.microsoft.com/office/drawing/2016/5/14/chartex" xmlns:mc="http://schemas.openxmlformats.org/markup-compatibility/2006" xmlns:aink="http://schemas.microsoft.com/office/drawing/2016/ink" xmlns:am3d="http://schemas.microsoft.com/office/drawing/2017/model3d" xmlns:o="urn:schemas-microsoft-com:office:office" xmlns:oel="http://schemas.microsoft.com/office/2019/extlst" xmlns:r="http://schemas.openxmlformats.org/officeDocument/2006/relationships" xmlns:m="http://schemas.openxmlformats.org/officeDocument/2006/math" xmlns:v="urn:schemas-microsoft-com:vml" xmlns:wp14="http://schemas.microsoft.com/office/word/2010/wordprocessingDrawing" xmlns:wp="http://schemas.openxmlformats.org/drawingml/2006/wordprocessingDrawing" xmlns:w10="urn:schemas-microsoft-com:office:word" xmlns:w="http://schemas.openxmlformats.org/wordprocessingml/2006/main" xmlns:w14="http://schemas.microsoft.com/office/word/2010/wordml" xmlns:w15="http://schemas.microsoft.com/office/word/2012/wordml" xmlns:w16cex="http://schemas.microsoft.com/office/word/2018/wordml/cex" xmlns:w16cid="http://schemas.microsoft.com/office/word/2016/wordml/cid" xmlns:w16="http://schemas.microsoft.com/office/word/2018/wordml" xmlns:w16du="http://schemas.microsoft.com/office/word/2023/wordml/word16du" xmlns:w16sdtdh="http://schemas.microsoft.com/office/word/2020/wordml/sdtdatahash" xmlns:w16sdtfl="http://schemas.microsoft.com/office/word/2024/wordml/sdtformatlock" xmlns:w16se="http://schemas.microsoft.com/office/word/2015/wordml/symex" xmlns:wpg="http://schemas.microsoft.com/office/word/2010/wordprocessingGroup" xmlns:wpi="http://schemas.microsoft.com/office/word/2010/wordprocessingInk" xmlns:wne="http://schemas.microsoft.com/office/word/2006/wordml" xmlns:wps="http://schemas.microsoft.com/office/word/2010/wordprocessingShape" mc:Ignorable="w14 w15 w16se w16cid w16 w16cex w16sdtdh w16sdtfl w16du wp14">
+  <w:endnote w:type="separator" w:id="-1">
+    <w:p>
+      <w:pPr>
+        <w:spacing w:after="0" w:line="240" w:lineRule="auto"/>
+      </w:pPr>
+      <w:r>
+        <w:separator/>
+      </w:r>
+    </w:p>
+  </w:endnote>
+  <w:endnote w:type="continuationSeparator" w:id="0">
+    <w:p>
+      <w:pPr>
+        <w:spacing w:after="0" w:line="240" w:lineRule="auto"/>
+      </w:pPr>
+      <w:r>
+        <w:continuationSeparator/>
+      </w:r>
+    </w:p>
+  </w:endnote>
+</w:endnotes>
+</file>
+
+<file path=word/footer1.xml><?xml version="1.0" encoding="utf-8"?>
+<w:ftr xmlns:wpc="http://schemas.microsoft.com/office/word/2010/wordprocessingCanvas" xmlns:cx="http://schemas.microsoft.com/office/drawing/2014/chartex" xmlns:cx1="http://schemas.microsoft.com/office/drawing/2015/9/8/chartex" xmlns:cx2="http://schemas.microsoft.com/office/drawing/2015/10/21/chartex" xmlns:cx3="http://schemas.microsoft.com/office/drawing/2016/5/9/chartex" xmlns:cx4="http://schemas.microsoft.com/office/drawing/2016/5/10/chartex" xmlns:cx5="http://schemas.microsoft.com/office/drawing/2016/5/11/chartex" xmlns:cx6="http://schemas.microsoft.com/office/drawing/2016/5/12/chartex" xmlns:cx7="http://schemas.microsoft.com/office/drawing/2016/5/13/chartex" xmlns:cx8="http://schemas.microsoft.com/office/drawing/2016/5/14/chartex" xmlns:mc="http://schemas.openxmlformats.org/markup-compatibility/2006" xmlns:aink="http://schemas.microsoft.com/office/drawing/2016/ink" xmlns:am3d="http://schemas.microsoft.com/office/drawing/2017/model3d" xmlns:o="urn:schemas-microsoft-com:office:office" xmlns:oel="http://schemas.microsoft.com/office/2019/extlst" xmlns:r="http://schemas.openxmlformats.org/officeDocument/2006/relationships" xmlns:m="http://schemas.openxmlformats.org/officeDocument/2006/math" xmlns:v="urn:schemas-microsoft-com:vml" xmlns:wp14="http://schemas.microsoft.com/office/word/2010/wordprocessingDrawing" xmlns:wp="http://schemas.openxmlformats.org/drawingml/2006/wordprocessingDrawing" xmlns:w10="urn:schemas-microsoft-com:office:word" xmlns:w="http://schemas.openxmlformats.org/wordprocessingml/2006/main" xmlns:w14="http://schemas.microsoft.com/office/word/2010/wordml" xmlns:w15="http://schemas.microsoft.com/office/word/2012/wordml" xmlns:w16cex="http://schemas.microsoft.com/office/word/2018/wordml/cex" xmlns:w16cid="http://schemas.microsoft.com/office/word/2016/wordml/cid" xmlns:w16="http://schemas.microsoft.com/office/word/2018/wordml" xmlns:w16du="http://schemas.microsoft.com/office/word/2023/wordml/word16du" xmlns:w16sdtdh="http://schemas.microsoft.com/office/word/2020/wordml/sdtdatahash" xmlns:w16sdtfl="http://schemas.microsoft.com/office/word/2024/wordml/sdtformatlock" xmlns:w16se="http://schemas.microsoft.com/office/word/2015/wordml/symex" xmlns:wpg="http://schemas.microsoft.com/office/word/2010/wordprocessingGroup" xmlns:wpi="http://schemas.microsoft.com/office/word/2010/wordprocessingInk" xmlns:wne="http://schemas.microsoft.com/office/word/2006/wordml" xmlns:wps="http://schemas.microsoft.com/office/word/2010/wordprocessingShape" mc:Ignorable="w14 w15 w16se w16cid w16 w16cex w16sdtdh w16sdtfl w16du wp14">
+  <w:sdt>
+    <w:sdtPr>
+      <w:id w:val="-298846742"/>
+      <w:docPartObj>
+        <w:docPartGallery w:val="Page Numbers (Bottom of Page)"/>
+        <w:docPartUnique/>
+      </w:docPartObj>
+    </w:sdtPr>
+    <w:sdtEndPr>
+      <w:rPr>
+        <w:noProof/>
+      </w:rPr>
+    </w:sdtEndPr>
+    <w:sdtContent>
+      <w:p>
+        <w:pPr>
+          <w:pStyle w:val="Footer"/>
+          <w:jc w:val="right"/>
+        </w:pPr>
+        <w:r>
+          <w:fldChar w:fldCharType="begin"/>
+        </w:r>
+        <w:r>
+          <w:instrText xml:space="preserve"> PAGE   \* MERGEFORMAT </w:instrText>
+        </w:r>
+        <w:r>
+          <w:fldChar w:fldCharType="separate"/>
+        </w:r>
+        <w:r>
+          <w:rPr>
+            <w:noProof/>
+          </w:rPr>
+          <w:t>2</w:t>
+        </w:r>
+        <w:r>
+          <w:rPr>
+            <w:noProof/>
+          </w:rPr>
+          <w:fldChar w:fldCharType="end"/>
+        </w:r>
+      </w:p>
+    </w:sdtContent>
+  </w:sdt>
+  <w:p>
+    <w:pPr>
+      <w:pStyle w:val="Footer"/>
+    </w:pPr>
+  </w:p>
+</w:ftr>
+</file>
+
+<file path=word/footnotes.xml><?xml version="1.0" encoding="utf-8"?>
+<w:footnotes xmlns:wpc="http://schemas.microsoft.com/office/word/2010/wordprocessingCanvas" xmlns:cx="http://schemas.microsoft.com/office/drawing/2014/chartex" xmlns:cx1="http://schemas.microsoft.com/office/drawing/2015/9/8/chartex" xmlns:cx2="http://schemas.microsoft.com/office/drawing/2015/10/21/chartex" xmlns:cx3="http://schemas.microsoft.com/office/drawing/2016/5/9/chartex" xmlns:cx4="http://schemas.microsoft.com/office/drawing/2016/5/10/chartex" xmlns:cx5="http://schemas.microsoft.com/office/drawing/2016/5/11/chartex" xmlns:cx6="http://schemas.microsoft.com/office/drawing/2016/5/12/chartex" xmlns:cx7="http://schemas.microsoft.com/office/drawing/2016/5/13/chartex" xmlns:cx8="http://schemas.microsoft.com/office/drawing/2016/5/14/chartex" xmlns:mc="http://schemas.openxmlformats.org/markup-compatibility/2006" xmlns:aink="http://schemas.microsoft.com/office/drawing/2016/ink" xmlns:am3d="http://schemas.microsoft.com/office/drawing/2017/model3d" xmlns:o="urn:schemas-microsoft-com:office:office" xmlns:oel="http://schemas.microsoft.com/office/2019/extlst" xmlns:r="http://schemas.openxmlformats.org/officeDocument/2006/relationships" xmlns:m="http://schemas.openxmlformats.org/officeDocument/2006/math" xmlns:v="urn:schemas-microsoft-com:vml" xmlns:wp14="http://schemas.microsoft.com/office/word/2010/wordprocessingDrawing" xmlns:wp="http://schemas.openxmlformats.org/drawingml/2006/wordprocessingDrawing" xmlns:w10="urn:schemas-microsoft-com:office:word" xmlns:w="http://schemas.openxmlformats.org/wordprocessingml/2006/main" xmlns:w14="http://schemas.microsoft.com/office/word/2010/wordml" xmlns:w15="http://schemas.microsoft.com/office/word/2012/wordml" xmlns:w16cex="http://schemas.microsoft.com/office/word/2018/wordml/cex" xmlns:w16cid="http://schemas.microsoft.com/office/word/2016/wordml/cid" xmlns:w16="http://schemas.microsoft.com/office/word/2018/wordml" xmlns:w16du="http://schemas.microsoft.com/office/word/2023/wordml/word16du" xmlns:w16sdtdh="http://schemas.microsoft.com/office/word/2020/wordml/sdtdatahash" xmlns:w16sdtfl="http://schemas.microsoft.com/office/word/2024/wordml/sdtformatlock" xmlns:w16se="http://schemas.microsoft.com/office/word/2015/wordml/symex" xmlns:wpg="http://schemas.microsoft.com/office/word/2010/wordprocessingGroup" xmlns:wpi="http://schemas.microsoft.com/office/word/2010/wordprocessingInk" xmlns:wne="http://schemas.microsoft.com/office/word/2006/wordml" xmlns:wps="http://schemas.microsoft.com/office/word/2010/wordprocessingShape" mc:Ignorable="w14 w15 w16se w16cid w16 w16cex w16sdtdh w16sdtfl w16du wp14">
+  <w:footnote w:type="separator" w:id="-1">
+    <w:p>
+      <w:pPr>
+        <w:spacing w:after="0" w:line="240" w:lineRule="auto"/>
+      </w:pPr>
+      <w:r>
+        <w:separator/>
+      </w:r>
+    </w:p>
+  </w:footnote>
+  <w:footnote w:type="continuationSeparator" w:id="0">
+    <w:p>
+      <w:pPr>
+        <w:spacing w:after="0" w:line="240" w:lineRule="auto"/>
+      </w:pPr>
+      <w:r>
+        <w:continuationSeparator/>
+      </w:r>
+    </w:p>
+  </w:footnote>
+</w:footnotes>
+</file>
+
+<file path=word/numbering.xml><?xml version="1.0" encoding="utf-8"?>
+<w:numbering xmlns:wpc="http://schemas.microsoft.com/office/word/2010/wordprocessingCanvas" xmlns:cx="http://schemas.microsoft.com/office/drawing/2014/chartex" xmlns:cx1="http://schemas.microsoft.com/office/drawing/2015/9/8/chartex" xmlns:cx2="http://schemas.microsoft.com/office/drawing/2015/10/21/chartex" xmlns:cx3="http://schemas.microsoft.com/office/drawing/2016/5/9/chartex" xmlns:cx4="http://schemas.microsoft.com/office/drawing/2016/5/10/chartex" xmlns:cx5="http://schemas.microsoft.com/office/drawing/2016/5/11/chartex" xmlns:cx6="http://schemas.microsoft.com/office/drawing/2016/5/12/chartex" xmlns:cx7="http://schemas.microsoft.com/office/drawing/2016/5/13/chartex" xmlns:cx8="http://schemas.microsoft.com/office/drawing/2016/5/14/chartex" xmlns:mc="http://schemas.openxmlformats.org/markup-compatibility/2006" xmlns:aink="http://schemas.microsoft.com/office/drawing/2016/ink" xmlns:am3d="http://schemas.microsoft.com/office/drawing/2017/model3d" xmlns:o="urn:schemas-microsoft-com:office:office" xmlns:oel="http://schemas.microsoft.com/office/2019/extlst" xmlns:r="http://schemas.openxmlformats.org/officeDocument/2006/relationships" xmlns:m="http://schemas.openxmlformats.org/officeDocument/2006/math" xmlns:v="urn:schemas-microsoft-com:vml" xmlns:wp14="http://schemas.microsoft.com/office/word/2010/wordprocessingDrawing" xmlns:wp="http://schemas.openxmlformats.org/drawingml/2006/wordprocessingDrawing" xmlns:w10="urn:schemas-microsoft-com:office:word" xmlns:w="http://schemas.openxmlformats.org/wordprocessingml/2006/main" xmlns:w14="http://schemas.microsoft.com/office/word/2010/wordml" xmlns:w15="http://schemas.microsoft.com/office/word/2012/wordml" xmlns:w16cex="http://schemas.microsoft.com/office/word/2018/wordml/cex" xmlns:w16cid="http://schemas.microsoft.com/office/word/2016/wordml/cid" xmlns:w16="http://schemas.microsoft.com/office/word/2018/wordml" xmlns:w16du="http://schemas.microsoft.com/office/word/2023/wordml/word16du" xmlns:w16sdtdh="http://schemas.microsoft.com/office/word/2020/wordml/sdtdatahash" xmlns:w16sdtfl="http://schemas.microsoft.com/office/word/2024/wordml/sdtformatlock" xmlns:w16se="http://schemas.microsoft.com/office/word/2015/wordml/symex" xmlns:wpg="http://schemas.microsoft.com/office/word/2010/wordprocessingGroup" xmlns:wpi="http://schemas.microsoft.com/office/word/2010/wordprocessingInk" xmlns:wne="http://schemas.microsoft.com/office/word/2006/wordml" xmlns:wps="http://schemas.microsoft.com/office/word/2010/wordprocessingShape" mc:Ignorable="w14 w15 w16se w16cid w16 w16cex w16sdtdh w16sdtfl w16du wp14">
+  <w:abstractNum w:abstractNumId="0" w15:restartNumberingAfterBreak="0">
+    <w:nsid w:val="04A8538B"/>
+    <w:multiLevelType w:val="hybridMultilevel"/>
+    <w:tmpl w:val="5F70AA40"/>
+    <w:lvl w:ilvl="0" w:tplc="1C090001">
+      <w:start w:val="1"/>
+      <w:numFmt w:val="bullet"/>
+      <w:lvlText w:val=""/>
+      <w:lvlJc w:val="left"/>
+      <w:pPr>
+        <w:ind w:left="720" w:hanging="360"/>
+      </w:pPr>
+      <w:rPr>
+        <w:rFonts w:ascii="Symbol" w:hAnsi="Symbol" w:hint="default"/>
+      </w:rPr>
+    </w:lvl>
+    <w:lvl w:ilvl="1" w:tplc="1C090003" w:tentative="1">
+      <w:start w:val="1"/>
+      <w:numFmt w:val="bullet"/>
+      <w:lvlText w:val="o"/>
+      <w:lvlJc w:val="left"/>
+      <w:pPr>
+        <w:ind w:left="1440" w:hanging="360"/>
+      </w:pPr>
+      <w:rPr>
+        <w:rFonts w:ascii="Courier New" w:hAnsi="Courier New" w:cs="Courier New" w:hint="default"/>
+      </w:rPr>
+    </w:lvl>
+    <w:lvl w:ilvl="2" w:tplc="1C090005" w:tentative="1">
+      <w:start w:val="1"/>
+      <w:numFmt w:val="bullet"/>
+      <w:lvlText w:val=""/>
+      <w:lvlJc w:val="left"/>
+      <w:pPr>
+        <w:ind w:left="2160" w:hanging="360"/>
+      </w:pPr>
+      <w:rPr>
+        <w:rFonts w:ascii="Wingdings" w:hAnsi="Wingdings" w:hint="default"/>
+      </w:rPr>
+    </w:lvl>
+    <w:lvl w:ilvl="3" w:tplc="1C090001" w:tentative="1">
+      <w:start w:val="1"/>
+      <w:numFmt w:val="bullet"/>
+      <w:lvlText w:val=""/>
+      <w:lvlJc w:val="left"/>
+      <w:pPr>
+        <w:ind w:left="2880" w:hanging="360"/>
+      </w:pPr>
+      <w:rPr>
+        <w:rFonts w:ascii="Symbol" w:hAnsi="Symbol" w:hint="default"/>
+      </w:rPr>
+    </w:lvl>
+    <w:lvl w:ilvl="4" w:tplc="1C090003" w:tentative="1">
+      <w:start w:val="1"/>
+      <w:numFmt w:val="bullet"/>
+      <w:lvlText w:val="o"/>
+      <w:lvlJc w:val="left"/>
+      <w:pPr>
+        <w:ind w:left="3600" w:hanging="360"/>
+      </w:pPr>
+      <w:rPr>
+        <w:rFonts w:ascii="Courier New" w:hAnsi="Courier New" w:cs="Courier New" w:hint="default"/>
+      </w:rPr>
+    </w:lvl>
+    <w:lvl w:ilvl="5" w:tplc="1C090005" w:tentative="1">
+      <w:start w:val="1"/>
+      <w:numFmt w:val="bullet"/>
+      <w:lvlText w:val=""/>
+      <w:lvlJc w:val="left"/>
+      <w:pPr>
+        <w:ind w:left="4320" w:hanging="360"/>
+      </w:pPr>
+      <w:rPr>
+        <w:rFonts w:ascii="Wingdings" w:hAnsi="Wingdings" w:hint="default"/>
+      </w:rPr>
+    </w:lvl>
+    <w:lvl w:ilvl="6" w:tplc="1C090001" w:tentative="1">
+      <w:start w:val="1"/>
+      <w:numFmt w:val="bullet"/>
+      <w:lvlText w:val=""/>
+      <w:lvlJc w:val="left"/>
+      <w:pPr>
+        <w:ind w:left="5040" w:hanging="360"/>
+      </w:pPr>
+      <w:rPr>
+        <w:rFonts w:ascii="Symbol" w:hAnsi="Symbol" w:hint="default"/>
+      </w:rPr>
+    </w:lvl>
+    <w:lvl w:ilvl="7" w:tplc="1C090003" w:tentative="1">
+      <w:start w:val="1"/>
+      <w:numFmt w:val="bullet"/>
+      <w:lvlText w:val="o"/>
+      <w:lvlJc w:val="left"/>
+      <w:pPr>
+        <w:ind w:left="5760" w:hanging="360"/>
+      </w:pPr>
+      <w:rPr>
+        <w:rFonts w:ascii="Courier New" w:hAnsi="Courier New" w:cs="Courier New" w:hint="default"/>
+      </w:rPr>
+    </w:lvl>
+    <w:lvl w:ilvl="8" w:tplc="1C090005" w:tentative="1">
+      <w:start w:val="1"/>
+      <w:numFmt w:val="bullet"/>
+      <w:lvlText w:val=""/>
+      <w:lvlJc w:val="left"/>
+      <w:pPr>
+        <w:ind w:left="6480" w:hanging="360"/>
+      </w:pPr>
+      <w:rPr>
+        <w:rFonts w:ascii="Wingdings" w:hAnsi="Wingdings" w:hint="default"/>
+      </w:rPr>
+    </w:lvl>
+  </w:abstractNum>
+  <w:abstractNum w:abstractNumId="1" w15:restartNumberingAfterBreak="0">
+    <w:nsid w:val="23995124"/>
+    <w:multiLevelType w:val="hybridMultilevel"/>
+    <w:tmpl w:val="39609F74"/>
+    <w:lvl w:ilvl="0" w:tplc="1C090001">
+      <w:start w:val="1"/>
+      <w:numFmt w:val="bullet"/>
+      <w:lvlText w:val=""/>
+      <w:lvlJc w:val="left"/>
+      <w:pPr>
+        <w:ind w:left="720" w:hanging="360"/>
+      </w:pPr>
+      <w:rPr>
+        <w:rFonts w:ascii="Symbol" w:hAnsi="Symbol" w:hint="default"/>
+      </w:rPr>
+    </w:lvl>
+    <w:lvl w:ilvl="1" w:tplc="1C090003" w:tentative="1">
+      <w:start w:val="1"/>
+      <w:numFmt w:val="bullet"/>
+      <w:lvlText w:val="o"/>
+      <w:lvlJc w:val="left"/>
+      <w:pPr>
+        <w:ind w:left="1440" w:hanging="360"/>
+      </w:pPr>
+      <w:rPr>
+        <w:rFonts w:ascii="Courier New" w:hAnsi="Courier New" w:cs="Courier New" w:hint="default"/>
+      </w:rPr>
+    </w:lvl>
+    <w:lvl w:ilvl="2" w:tplc="1C090005" w:tentative="1">
+      <w:start w:val="1"/>
+      <w:numFmt w:val="bullet"/>
+      <w:lvlText w:val=""/>
+      <w:lvlJc w:val="left"/>
+      <w:pPr>
+        <w:ind w:left="2160" w:hanging="360"/>
+      </w:pPr>
+      <w:rPr>
+        <w:rFonts w:ascii="Wingdings" w:hAnsi="Wingdings" w:hint="default"/>
+      </w:rPr>
+    </w:lvl>
+    <w:lvl w:ilvl="3" w:tplc="1C090001" w:tentative="1">
+      <w:start w:val="1"/>
+      <w:numFmt w:val="bullet"/>
+      <w:lvlText w:val=""/>
+      <w:lvlJc w:val="left"/>
+      <w:pPr>
+        <w:ind w:left="2880" w:hanging="360"/>
+      </w:pPr>
+      <w:rPr>
+        <w:rFonts w:ascii="Symbol" w:hAnsi="Symbol" w:hint="default"/>
+      </w:rPr>
+    </w:lvl>
+    <w:lvl w:ilvl="4" w:tplc="1C090003" w:tentative="1">
+      <w:start w:val="1"/>
+      <w:numFmt w:val="bullet"/>
+      <w:lvlText w:val="o"/>
+      <w:lvlJc w:val="left"/>
+      <w:pPr>
+        <w:ind w:left="3600" w:hanging="360"/>
+      </w:pPr>
+      <w:rPr>
+        <w:rFonts w:ascii="Courier New" w:hAnsi="Courier New" w:cs="Courier New" w:hint="default"/>
+      </w:rPr>
+    </w:lvl>
+    <w:lvl w:ilvl="5" w:tplc="1C090005" w:tentative="1">
+      <w:start w:val="1"/>
+      <w:numFmt w:val="bullet"/>
+      <w:lvlText w:val=""/>
+      <w:lvlJc w:val="left"/>
+      <w:pPr>
+        <w:ind w:left="4320" w:hanging="360"/>
+      </w:pPr>
+      <w:rPr>
+        <w:rFonts w:ascii="Wingdings" w:hAnsi="Wingdings" w:hint="default"/>
+      </w:rPr>
+    </w:lvl>
+    <w:lvl w:ilvl="6" w:tplc="1C090001" w:tentative="1">
+      <w:start w:val="1"/>
+      <w:numFmt w:val="bullet"/>
+      <w:lvlText w:val=""/>
+      <w:lvlJc w:val="left"/>
+      <w:pPr>
+        <w:ind w:left="5040" w:hanging="360"/>
+      </w:pPr>
+      <w:rPr>
+        <w:rFonts w:ascii="Symbol" w:hAnsi="Symbol" w:hint="default"/>
+      </w:rPr>
+    </w:lvl>
+    <w:lvl w:ilvl="7" w:tplc="1C090003" w:tentative="1">
+      <w:start w:val="1"/>
+      <w:numFmt w:val="bullet"/>
+      <w:lvlText w:val="o"/>
+      <w:lvlJc w:val="left"/>
+      <w:pPr>
+        <w:ind w:left="5760" w:hanging="360"/>
+      </w:pPr>
+      <w:rPr>
+        <w:rFonts w:ascii="Courier New" w:hAnsi="Courier New" w:cs="Courier New" w:hint="default"/>
+      </w:rPr>
+    </w:lvl>
+    <w:lvl w:ilvl="8" w:tplc="1C090005" w:tentative="1">
+      <w:start w:val="1"/>
+      <w:numFmt w:val="bullet"/>
+      <w:lvlText w:val=""/>
+      <w:lvlJc w:val="left"/>
+      <w:pPr>
+        <w:ind w:left="6480" w:hanging="360"/>
+      </w:pPr>
+      <w:rPr>
+        <w:rFonts w:ascii="Wingdings" w:hAnsi="Wingdings" w:hint="default"/>
+      </w:rPr>
+    </w:lvl>
+  </w:abstractNum>
+  <w:abstractNum w:abstractNumId="2" w15:restartNumberingAfterBreak="0">
+    <w:nsid w:val="58585DEB"/>
+    <w:multiLevelType w:val="multilevel"/>
+    <w:tmpl w:val="7F72A53A"/>
+    <w:lvl w:ilvl="0">
+      <w:start w:val="1"/>
+      <w:numFmt w:val="decimal"/>
+      <w:lvlText w:val="%1."/>
+      <w:lvlJc w:val="left"/>
+      <w:pPr>
+        <w:tabs>
+          <w:tab w:val="num" w:pos="720"/>
+        </w:tabs>
+        <w:ind w:left="720" w:hanging="360"/>
+      </w:pPr>
+    </w:lvl>
+    <w:lvl w:ilvl="1" w:tentative="1">
+      <w:start w:val="1"/>
+      <w:numFmt w:val="decimal"/>
+      <w:lvlText w:val="%2."/>
+      <w:lvlJc w:val="left"/>
+      <w:pPr>
+        <w:tabs>
+          <w:tab w:val="num" w:pos="1440"/>
+        </w:tabs>
+        <w:ind w:left="1440" w:hanging="360"/>
+      </w:pPr>
+    </w:lvl>
+    <w:lvl w:ilvl="2" w:tentative="1">
+      <w:start w:val="1"/>
+      <w:numFmt w:val="decimal"/>
+      <w:lvlText w:val="%3."/>
+      <w:lvlJc w:val="left"/>
+      <w:pPr>
+        <w:tabs>
+          <w:tab w:val="num" w:pos="2160"/>
+        </w:tabs>
+        <w:ind w:left="2160" w:hanging="360"/>
+      </w:pPr>
+    </w:lvl>
+    <w:lvl w:ilvl="3" w:tentative="1">
+      <w:start w:val="1"/>
+      <w:numFmt w:val="decimal"/>
+      <w:lvlText w:val="%4."/>
+      <w:lvlJc w:val="left"/>
+      <w:pPr>
+        <w:tabs>
+          <w:tab w:val="num" w:pos="2880"/>
+        </w:tabs>
+        <w:ind w:left="2880" w:hanging="360"/>
+      </w:pPr>
+    </w:lvl>
+    <w:lvl w:ilvl="4" w:tentative="1">
+      <w:start w:val="1"/>
+      <w:numFmt w:val="decimal"/>
+      <w:lvlText w:val="%5."/>
+      <w:lvlJc w:val="left"/>
+      <w:pPr>
+        <w:tabs>
+          <w:tab w:val="num" w:pos="3600"/>
+        </w:tabs>
+        <w:ind w:left="3600" w:hanging="360"/>
+      </w:pPr>
+    </w:lvl>
+    <w:lvl w:ilvl="5" w:tentative="1">
+      <w:start w:val="1"/>
+      <w:numFmt w:val="decimal"/>
+      <w:lvlText w:val="%6."/>
+      <w:lvlJc w:val="left"/>
+      <w:pPr>
+        <w:tabs>
+          <w:tab w:val="num" w:pos="4320"/>
+        </w:tabs>
+        <w:ind w:left="4320" w:hanging="360"/>
+      </w:pPr>
+    </w:lvl>
+    <w:lvl w:ilvl="6" w:tentative="1">
+      <w:start w:val="1"/>
+      <w:numFmt w:val="decimal"/>
+      <w:lvlText w:val="%7."/>
+      <w:lvlJc w:val="left"/>
+      <w:pPr>
+        <w:tabs>
+          <w:tab w:val="num" w:pos="5040"/>
+        </w:tabs>
+        <w:ind w:left="5040" w:hanging="360"/>
+      </w:pPr>
+    </w:lvl>
+    <w:lvl w:ilvl="7" w:tentative="1">
+      <w:start w:val="1"/>
+      <w:numFmt w:val="decimal"/>
+      <w:lvlText w:val="%8."/>
+      <w:lvlJc w:val="left"/>
+      <w:pPr>
+        <w:tabs>
+          <w:tab w:val="num" w:pos="5760"/>
+        </w:tabs>
+        <w:ind w:left="5760" w:hanging="360"/>
+      </w:pPr>
+    </w:lvl>
+    <w:lvl w:ilvl="8" w:tentative="1">
+      <w:start w:val="1"/>
+      <w:numFmt w:val="decimal"/>
+      <w:lvlText w:val="%9."/>
+      <w:lvlJc w:val="left"/>
+      <w:pPr>
+        <w:tabs>
+          <w:tab w:val="num" w:pos="6480"/>
+        </w:tabs>
+        <w:ind w:left="6480" w:hanging="360"/>
+      </w:pPr>
+    </w:lvl>
+  </w:abstractNum>
+  <w:abstractNum w:abstractNumId="3" w15:restartNumberingAfterBreak="0">
+    <w:nsid w:val="60311502"/>
+    <w:multiLevelType w:val="multilevel"/>
+    <w:tmpl w:val="4B103042"/>
+    <w:lvl w:ilvl="0">
+      <w:start w:val="1"/>
+      <w:numFmt w:val="bullet"/>
+      <w:lvlText w:val=""/>
+      <w:lvlJc w:val="left"/>
+      <w:pPr>
+        <w:tabs>
+          <w:tab w:val="num" w:pos="720"/>
+        </w:tabs>
+        <w:ind w:left="720" w:hanging="360"/>
+      </w:pPr>
+      <w:rPr>
+        <w:rFonts w:ascii="Symbol" w:hAnsi="Symbol" w:hint="default"/>
+        <w:sz w:val="20"/>
+      </w:rPr>
+    </w:lvl>
+    <w:lvl w:ilvl="1" w:tentative="1">
+      <w:start w:val="1"/>
+      <w:numFmt w:val="bullet"/>
+      <w:lvlText w:val="o"/>
+      <w:lvlJc w:val="left"/>
+      <w:pPr>
+        <w:tabs>
+          <w:tab w:val="num" w:pos="1440"/>
+        </w:tabs>
+        <w:ind w:left="1440" w:hanging="360"/>
+      </w:pPr>
+      <w:rPr>
+        <w:rFonts w:ascii="Courier New" w:hAnsi="Courier New" w:hint="default"/>
+        <w:sz w:val="20"/>
+      </w:rPr>
+    </w:lvl>
+    <w:lvl w:ilvl="2" w:tentative="1">
+      <w:start w:val="1"/>
+      <w:numFmt w:val="bullet"/>
+      <w:lvlText w:val=""/>
+      <w:lvlJc w:val="left"/>
+      <w:pPr>
+        <w:tabs>
+          <w:tab w:val="num" w:pos="2160"/>
+        </w:tabs>
+        <w:ind w:left="2160" w:hanging="360"/>
+      </w:pPr>
+      <w:rPr>
+        <w:rFonts w:ascii="Wingdings" w:hAnsi="Wingdings" w:hint="default"/>
+        <w:sz w:val="20"/>
+      </w:rPr>
+    </w:lvl>
+    <w:lvl w:ilvl="3" w:tentative="1">
+      <w:start w:val="1"/>
+      <w:numFmt w:val="bullet"/>
+      <w:lvlText w:val=""/>
+      <w:lvlJc w:val="left"/>
+      <w:pPr>
+        <w:tabs>
+          <w:tab w:val="num" w:pos="2880"/>
+        </w:tabs>
+        <w:ind w:left="2880" w:hanging="360"/>
+      </w:pPr>
+      <w:rPr>
+        <w:rFonts w:ascii="Wingdings" w:hAnsi="Wingdings" w:hint="default"/>
+        <w:sz w:val="20"/>
+      </w:rPr>
+    </w:lvl>
+    <w:lvl w:ilvl="4" w:tentative="1">
+      <w:start w:val="1"/>
+      <w:numFmt w:val="bullet"/>
+      <w:lvlText w:val=""/>
+      <w:lvlJc w:val="left"/>
+      <w:pPr>
+        <w:tabs>
+          <w:tab w:val="num" w:pos="3600"/>
+        </w:tabs>
+        <w:ind w:left="3600" w:hanging="360"/>
+      </w:pPr>
+      <w:rPr>
+        <w:rFonts w:ascii="Wingdings" w:hAnsi="Wingdings" w:hint="default"/>
+        <w:sz w:val="20"/>
+      </w:rPr>
+    </w:lvl>
+    <w:lvl w:ilvl="5" w:tentative="1">
+      <w:start w:val="1"/>
+      <w:numFmt w:val="bullet"/>
+      <w:lvlText w:val=""/>
+      <w:lvlJc w:val="left"/>
+      <w:pPr>
+        <w:tabs>
+          <w:tab w:val="num" w:pos="4320"/>
+        </w:tabs>
+        <w:ind w:left="4320" w:hanging="360"/>
+      </w:pPr>
+      <w:rPr>
+        <w:rFonts w:ascii="Wingdings" w:hAnsi="Wingdings" w:hint="default"/>
+        <w:sz w:val="20"/>
+      </w:rPr>
+    </w:lvl>
+    <w:lvl w:ilvl="6" w:tentative="1">
+      <w:start w:val="1"/>
+      <w:numFmt w:val="bullet"/>
+      <w:lvlText w:val=""/>
+      <w:lvlJc w:val="left"/>
+      <w:pPr>
+        <w:tabs>
+          <w:tab w:val="num" w:pos="5040"/>
+        </w:tabs>
+        <w:ind w:left="5040" w:hanging="360"/>
+      </w:pPr>
+      <w:rPr>
+        <w:rFonts w:ascii="Wingdings" w:hAnsi="Wingdings" w:hint="default"/>
+        <w:sz w:val="20"/>
+      </w:rPr>
+    </w:lvl>
+    <w:lvl w:ilvl="7" w:tentative="1">
+      <w:start w:val="1"/>
+      <w:numFmt w:val="bullet"/>
+      <w:lvlText w:val=""/>
+      <w:lvlJc w:val="left"/>
+      <w:pPr>
+        <w:tabs>
+          <w:tab w:val="num" w:pos="5760"/>
+        </w:tabs>
+        <w:ind w:left="5760" w:hanging="360"/>
+      </w:pPr>
+      <w:rPr>
+        <w:rFonts w:ascii="Wingdings" w:hAnsi="Wingdings" w:hint="default"/>
+        <w:sz w:val="20"/>
+      </w:rPr>
+    </w:lvl>
+    <w:lvl w:ilvl="8" w:tentative="1">
+      <w:start w:val="1"/>
+      <w:numFmt w:val="bullet"/>
+      <w:lvlText w:val=""/>
+      <w:lvlJc w:val="left"/>
+      <w:pPr>
+        <w:tabs>
+          <w:tab w:val="num" w:pos="6480"/>
+        </w:tabs>
+        <w:ind w:left="6480" w:hanging="360"/>
+      </w:pPr>
+      <w:rPr>
+        <w:rFonts w:ascii="Wingdings" w:hAnsi="Wingdings" w:hint="default"/>
+        <w:sz w:val="20"/>
+      </w:rPr>
+    </w:lvl>
+  </w:abstractNum>
+  <w:abstractNum w:abstractNumId="4" w15:restartNumberingAfterBreak="0">
+    <w:nsid w:val="635C1B6E"/>
+    <w:multiLevelType w:val="hybridMultilevel"/>
+    <w:tmpl w:val="244829D2"/>
+    <w:lvl w:ilvl="0" w:tplc="1C090001">
+      <w:start w:val="1"/>
+      <w:numFmt w:val="bullet"/>
+      <w:lvlText w:val=""/>
+      <w:lvlJc w:val="left"/>
+      <w:pPr>
+        <w:ind w:left="720" w:hanging="360"/>
+      </w:pPr>
+      <w:rPr>
+        <w:rFonts w:ascii="Symbol" w:hAnsi="Symbol" w:hint="default"/>
+      </w:rPr>
+    </w:lvl>
+    <w:lvl w:ilvl="1" w:tplc="1C090003" w:tentative="1">
+      <w:start w:val="1"/>
+      <w:numFmt w:val="bullet"/>
+      <w:lvlText w:val="o"/>
+      <w:lvlJc w:val="left"/>
+      <w:pPr>
+        <w:ind w:left="1440" w:hanging="360"/>
+      </w:pPr>
+      <w:rPr>
+        <w:rFonts w:ascii="Courier New" w:hAnsi="Courier New" w:cs="Courier New" w:hint="default"/>
+      </w:rPr>
+    </w:lvl>
+    <w:lvl w:ilvl="2" w:tplc="1C090005" w:tentative="1">
+      <w:start w:val="1"/>
+      <w:numFmt w:val="bullet"/>
+      <w:lvlText w:val=""/>
+      <w:lvlJc w:val="left"/>
+      <w:pPr>
+        <w:ind w:left="2160" w:hanging="360"/>
+      </w:pPr>
+      <w:rPr>
+        <w:rFonts w:ascii="Wingdings" w:hAnsi="Wingdings" w:hint="default"/>
+      </w:rPr>
+    </w:lvl>
+    <w:lvl w:ilvl="3" w:tplc="1C090001" w:tentative="1">
+      <w:start w:val="1"/>
+      <w:numFmt w:val="bullet"/>
+      <w:lvlText w:val=""/>
+      <w:lvlJc w:val="left"/>
+      <w:pPr>
+        <w:ind w:left="2880" w:hanging="360"/>
+      </w:pPr>
+      <w:rPr>
+        <w:rFonts w:ascii="Symbol" w:hAnsi="Symbol" w:hint="default"/>
+      </w:rPr>
+    </w:lvl>
+    <w:lvl w:ilvl="4" w:tplc="1C090003" w:tentative="1">
+      <w:start w:val="1"/>
+      <w:numFmt w:val="bullet"/>
+      <w:lvlText w:val="o"/>
+      <w:lvlJc w:val="left"/>
+      <w:pPr>
+        <w:ind w:left="3600" w:hanging="360"/>
+      </w:pPr>
+      <w:rPr>
+        <w:rFonts w:ascii="Courier New" w:hAnsi="Courier New" w:cs="Courier New" w:hint="default"/>
+      </w:rPr>
+    </w:lvl>
+    <w:lvl w:ilvl="5" w:tplc="1C090005" w:tentative="1">
+      <w:start w:val="1"/>
+      <w:numFmt w:val="bullet"/>
+      <w:lvlText w:val=""/>
+      <w:lvlJc w:val="left"/>
+      <w:pPr>
+        <w:ind w:left="4320" w:hanging="360"/>
+      </w:pPr>
+      <w:rPr>
+        <w:rFonts w:ascii="Wingdings" w:hAnsi="Wingdings" w:hint="default"/>
+      </w:rPr>
+    </w:lvl>
+    <w:lvl w:ilvl="6" w:tplc="1C090001" w:tentative="1">
+      <w:start w:val="1"/>
+      <w:numFmt w:val="bullet"/>
+      <w:lvlText w:val=""/>
+      <w:lvlJc w:val="left"/>
+      <w:pPr>
+        <w:ind w:left="5040" w:hanging="360"/>
+      </w:pPr>
+      <w:rPr>
+        <w:rFonts w:ascii="Symbol" w:hAnsi="Symbol" w:hint="default"/>
+      </w:rPr>
+    </w:lvl>
+    <w:lvl w:ilvl="7" w:tplc="1C090003" w:tentative="1">
+      <w:start w:val="1"/>
+      <w:numFmt w:val="bullet"/>
+      <w:lvlText w:val="o"/>
+      <w:lvlJc w:val="left"/>
+      <w:pPr>
+        <w:ind w:left="5760" w:hanging="360"/>
+      </w:pPr>
+      <w:rPr>
+        <w:rFonts w:ascii="Courier New" w:hAnsi="Courier New" w:cs="Courier New" w:hint="default"/>
+      </w:rPr>
+    </w:lvl>
+    <w:lvl w:ilvl="8" w:tplc="1C090005" w:tentative="1">
+      <w:start w:val="1"/>
+      <w:numFmt w:val="bullet"/>
+      <w:lvlText w:val=""/>
+      <w:lvlJc w:val="left"/>
+      <w:pPr>
+        <w:ind w:left="6480" w:hanging="360"/>
+      </w:pPr>
+      <w:rPr>
+        <w:rFonts w:ascii="Wingdings" w:hAnsi="Wingdings" w:hint="default"/>
+      </w:rPr>
+    </w:lvl>
+  </w:abstractNum>
+  <w:num w:numId="1" w16cid:durableId="1490631750">
+    <w:abstractNumId w:val="3"/>
+  </w:num>
+  <w:num w:numId="2" w16cid:durableId="620570305">
+    <w:abstractNumId w:val="0"/>
+  </w:num>
+  <w:num w:numId="3" w16cid:durableId="362563300">
+    <w:abstractNumId w:val="2"/>
+  </w:num>
+  <w:num w:numId="4" w16cid:durableId="1851795290">
+    <w:abstractNumId w:val="4"/>
+  </w:num>
+  <w:num w:numId="5" w16cid:durableId="1657369071">
+    <w:abstractNumId w:val="1"/>
+  </w:num>
+</w:numbering>
 </file>
 
 <file path=word/styles.xml><?xml version="1.0" encoding="utf-8"?>
@@ -508,7 +4845,6 @@
     <w:next w:val="Normal"/>
     <w:link w:val="Heading2Char"/>
     <w:uiPriority w:val="9"/>
-    <w:semiHidden/>
     <w:unhideWhenUsed/>
     <w:qFormat/>
     <w:rsid w:val="00C8092C"/>
@@ -683,7 +5019,6 @@
   <w:style w:type="character" w:default="1" w:styleId="DefaultParagraphFont">
     <w:name w:val="Default Paragraph Font"/>
     <w:uiPriority w:val="1"/>
-    <w:semiHidden/>
     <w:unhideWhenUsed/>
   </w:style>
   <w:style w:type="table" w:default="1" w:styleId="TableNormal">
@@ -725,7 +5060,6 @@
     <w:basedOn w:val="DefaultParagraphFont"/>
     <w:link w:val="Heading2"/>
     <w:uiPriority w:val="9"/>
-    <w:semiHidden/>
     <w:rsid w:val="00C8092C"/>
     <w:rPr>
       <w:rFonts w:asciiTheme="majorHAnsi" w:eastAsiaTheme="majorEastAsia" w:hAnsiTheme="majorHAnsi" w:cstheme="majorBidi"/>
@@ -996,6 +5330,137 @@
       <w:color w:val="0F4761" w:themeColor="accent1" w:themeShade="BF"/>
       <w:spacing w:val="5"/>
     </w:rPr>
+  </w:style>
+  <w:style w:type="paragraph" w:styleId="Header">
+    <w:name w:val="header"/>
+    <w:basedOn w:val="Normal"/>
+    <w:link w:val="HeaderChar"/>
+    <w:uiPriority w:val="99"/>
+    <w:unhideWhenUsed/>
+    <w:rsid w:val="00301898"/>
+    <w:pPr>
+      <w:tabs>
+        <w:tab w:val="center" w:pos="4513"/>
+        <w:tab w:val="right" w:pos="9026"/>
+      </w:tabs>
+      <w:spacing w:after="0" w:line="240" w:lineRule="auto"/>
+    </w:pPr>
+  </w:style>
+  <w:style w:type="character" w:customStyle="1" w:styleId="HeaderChar">
+    <w:name w:val="Header Char"/>
+    <w:basedOn w:val="DefaultParagraphFont"/>
+    <w:link w:val="Header"/>
+    <w:uiPriority w:val="99"/>
+    <w:rsid w:val="00301898"/>
+  </w:style>
+  <w:style w:type="paragraph" w:styleId="Footer">
+    <w:name w:val="footer"/>
+    <w:basedOn w:val="Normal"/>
+    <w:link w:val="FooterChar"/>
+    <w:uiPriority w:val="99"/>
+    <w:unhideWhenUsed/>
+    <w:rsid w:val="00301898"/>
+    <w:pPr>
+      <w:tabs>
+        <w:tab w:val="center" w:pos="4513"/>
+        <w:tab w:val="right" w:pos="9026"/>
+      </w:tabs>
+      <w:spacing w:after="0" w:line="240" w:lineRule="auto"/>
+    </w:pPr>
+  </w:style>
+  <w:style w:type="character" w:customStyle="1" w:styleId="FooterChar">
+    <w:name w:val="Footer Char"/>
+    <w:basedOn w:val="DefaultParagraphFont"/>
+    <w:link w:val="Footer"/>
+    <w:uiPriority w:val="99"/>
+    <w:rsid w:val="00301898"/>
+  </w:style>
+  <w:style w:type="table" w:styleId="TableGrid">
+    <w:name w:val="Table Grid"/>
+    <w:basedOn w:val="TableNormal"/>
+    <w:uiPriority w:val="39"/>
+    <w:rsid w:val="00B2179B"/>
+    <w:pPr>
+      <w:spacing w:after="0" w:line="240" w:lineRule="auto"/>
+    </w:pPr>
+    <w:tblPr>
+      <w:tblBorders>
+        <w:top w:val="single" w:sz="4" w:space="0" w:color="auto"/>
+        <w:left w:val="single" w:sz="4" w:space="0" w:color="auto"/>
+        <w:bottom w:val="single" w:sz="4" w:space="0" w:color="auto"/>
+        <w:right w:val="single" w:sz="4" w:space="0" w:color="auto"/>
+        <w:insideH w:val="single" w:sz="4" w:space="0" w:color="auto"/>
+        <w:insideV w:val="single" w:sz="4" w:space="0" w:color="auto"/>
+      </w:tblBorders>
+    </w:tblPr>
+  </w:style>
+  <w:style w:type="character" w:styleId="Hyperlink">
+    <w:name w:val="Hyperlink"/>
+    <w:basedOn w:val="DefaultParagraphFont"/>
+    <w:uiPriority w:val="99"/>
+    <w:unhideWhenUsed/>
+    <w:rsid w:val="00B2179B"/>
+    <w:rPr>
+      <w:color w:val="467886" w:themeColor="hyperlink"/>
+      <w:u w:val="single"/>
+    </w:rPr>
+  </w:style>
+  <w:style w:type="character" w:styleId="UnresolvedMention">
+    <w:name w:val="Unresolved Mention"/>
+    <w:basedOn w:val="DefaultParagraphFont"/>
+    <w:uiPriority w:val="99"/>
+    <w:semiHidden/>
+    <w:unhideWhenUsed/>
+    <w:rsid w:val="00B2179B"/>
+    <w:rPr>
+      <w:color w:val="605E5C"/>
+      <w:shd w:val="clear" w:color="auto" w:fill="E1DFDD"/>
+    </w:rPr>
+  </w:style>
+  <w:style w:type="paragraph" w:styleId="TOCHeading">
+    <w:name w:val="TOC Heading"/>
+    <w:basedOn w:val="Heading1"/>
+    <w:next w:val="Normal"/>
+    <w:uiPriority w:val="39"/>
+    <w:unhideWhenUsed/>
+    <w:qFormat/>
+    <w:rsid w:val="00B2179B"/>
+    <w:pPr>
+      <w:spacing w:before="240" w:after="0" w:line="259" w:lineRule="auto"/>
+      <w:outlineLvl w:val="9"/>
+    </w:pPr>
+    <w:rPr>
+      <w:kern w:val="0"/>
+      <w:sz w:val="32"/>
+      <w:szCs w:val="32"/>
+      <w:lang w:val="en-US"/>
+      <w14:ligatures w14:val="none"/>
+    </w:rPr>
+  </w:style>
+  <w:style w:type="paragraph" w:styleId="TOC1">
+    <w:name w:val="toc 1"/>
+    <w:basedOn w:val="Normal"/>
+    <w:next w:val="Normal"/>
+    <w:autoRedefine/>
+    <w:uiPriority w:val="39"/>
+    <w:unhideWhenUsed/>
+    <w:rsid w:val="00B2179B"/>
+    <w:pPr>
+      <w:spacing w:after="100"/>
+    </w:pPr>
+  </w:style>
+  <w:style w:type="paragraph" w:styleId="TOC2">
+    <w:name w:val="toc 2"/>
+    <w:basedOn w:val="Normal"/>
+    <w:next w:val="Normal"/>
+    <w:autoRedefine/>
+    <w:uiPriority w:val="39"/>
+    <w:unhideWhenUsed/>
+    <w:rsid w:val="00B2179B"/>
+    <w:pPr>
+      <w:spacing w:after="100"/>
+      <w:ind w:left="240"/>
+    </w:pPr>
   </w:style>
 </w:styles>
 </file>

</xml_diff>